<commit_message>
Rebuilt Training run in excel sheet and made Veteran Training book
</commit_message>
<xml_diff>
--- a/TrainingManual1_Veteran.docx
+++ b/TrainingManual1_Veteran.docx
@@ -33,7 +33,7 @@
         <w:pStyle w:val="ListParagraph"/>
         <w:numPr>
           <w:ilvl w:val="0"/>
-          <w:numId w:val="1"/>
+          <w:numId w:val="7"/>
         </w:numPr>
       </w:pPr>
       <w:r>
@@ -45,53 +45,442 @@
     </w:p>
     <w:p>
       <w:pPr>
+        <w:pStyle w:val="Quote"/>
+        <w:rPr>
+          <w:rStyle w:val="Emphasis"/>
+        </w:rPr>
+      </w:pPr>
+      <w:r>
+        <w:t>“</w:t>
+      </w:r>
+      <w:r>
+        <w:t xml:space="preserve">I </w:t>
+      </w:r>
+      <w:r>
+        <w:t>know how to train</w:t>
+      </w:r>
+      <w:r>
+        <w:t xml:space="preserve"> lots of high-quality</w:t>
+      </w:r>
+      <w:r>
+        <w:t xml:space="preserve"> Troops</w:t>
+      </w:r>
+      <w:r>
+        <w:t xml:space="preserve"> and will use them to </w:t>
+      </w:r>
+      <w:r>
+        <w:t xml:space="preserve">make sure I always have </w:t>
+      </w:r>
+      <w:r>
+        <w:t>Coins.</w:t>
+      </w:r>
+      <w:r>
+        <w:t>”</w:t>
+      </w:r>
+    </w:p>
+    <w:p>
+      <w:pPr>
+        <w:pStyle w:val="ListParagraph"/>
+        <w:numPr>
+          <w:ilvl w:val="0"/>
+          <w:numId w:val="7"/>
+        </w:numPr>
+      </w:pPr>
+      <w:r>
+        <w:t>Choose a color then take the Player</w:t>
+      </w:r>
+      <w:r>
+        <w:t xml:space="preserve"> Screen</w:t>
+      </w:r>
+      <w:r>
+        <w:t xml:space="preserve">, </w:t>
+      </w:r>
+      <w:r>
+        <w:t>Leaders</w:t>
+      </w:r>
+      <w:r>
+        <w:t xml:space="preserve"> (dice)</w:t>
+      </w:r>
+      <w:r>
+        <w:t>, Alliance Tokens</w:t>
+      </w:r>
+      <w:r>
+        <w:t>, and one Card Marker</w:t>
+      </w:r>
+      <w:r>
+        <w:t xml:space="preserve"> of your color.</w:t>
+      </w:r>
+      <w:r>
+        <w:t xml:space="preserve"> </w:t>
+      </w:r>
+      <w:r>
+        <w:t xml:space="preserve">Place everything </w:t>
+      </w:r>
+      <w:r>
+        <w:t>behind your Player Screen.</w:t>
+      </w:r>
+    </w:p>
+    <w:p>
+      <w:pPr>
+        <w:pStyle w:val="ListParagraph"/>
+        <w:numPr>
+          <w:ilvl w:val="0"/>
+          <w:numId w:val="7"/>
+        </w:numPr>
+      </w:pPr>
+      <w:r>
+        <w:t xml:space="preserve">Place one of your </w:t>
+      </w:r>
+      <w:r>
+        <w:t>Alliance Tokens on the start of the Honor Track.</w:t>
+      </w:r>
+    </w:p>
+    <w:p>
+      <w:pPr>
+        <w:pStyle w:val="ListParagraph"/>
+        <w:numPr>
+          <w:ilvl w:val="0"/>
+          <w:numId w:val="7"/>
+        </w:numPr>
+      </w:pPr>
+      <w:r>
+        <w:t xml:space="preserve">Keep one </w:t>
+      </w:r>
+      <w:r>
+        <w:t xml:space="preserve">of your </w:t>
+      </w:r>
+      <w:r>
+        <w:t>Alliance Token</w:t>
+      </w:r>
+      <w:r>
+        <w:t>s</w:t>
+      </w:r>
+      <w:r>
+        <w:t xml:space="preserve"> for each player (including yourself) and put the rest back in the box.</w:t>
+      </w:r>
+    </w:p>
+    <w:p>
+      <w:pPr>
         <w:pStyle w:val="ListParagraph"/>
         <w:numPr>
           <w:ilvl w:val="1"/>
-          <w:numId w:val="1"/>
-        </w:numPr>
-      </w:pPr>
-      <w:r>
+          <w:numId w:val="7"/>
+        </w:numPr>
+      </w:pPr>
+      <w:r>
+        <w:t>Ex. You should start with 6 Alliance Tokens in a 6-player game.</w:t>
+      </w:r>
+    </w:p>
+    <w:p>
+      <w:pPr>
+        <w:pStyle w:val="Heading2"/>
+      </w:pPr>
+      <w:r>
+        <w:t>Checkpoint</w:t>
+      </w:r>
+    </w:p>
+    <w:p>
+      <w:pPr>
+        <w:pStyle w:val="ListParagraph"/>
+        <w:numPr>
+          <w:ilvl w:val="0"/>
+          <w:numId w:val="8"/>
+        </w:numPr>
+      </w:pPr>
+      <w:r>
+        <w:t xml:space="preserve">Find </w:t>
+      </w:r>
+      <w:r>
+        <w:t xml:space="preserve">one copy of </w:t>
+      </w:r>
+      <w:r>
+        <w:t xml:space="preserve">the following Investments and put them </w:t>
+      </w:r>
+      <w:r>
+        <w:t>face-up</w:t>
+      </w:r>
+      <w:r>
+        <w:t xml:space="preserve"> in front of your Player</w:t>
+      </w:r>
+      <w:r>
+        <w:t xml:space="preserve"> Screen</w:t>
+      </w:r>
+      <w:r>
+        <w:t>:</w:t>
+      </w:r>
+    </w:p>
+    <w:p>
+      <w:pPr>
+        <w:pStyle w:val="ListParagraph"/>
+        <w:numPr>
+          <w:ilvl w:val="1"/>
+          <w:numId w:val="8"/>
+        </w:numPr>
+      </w:pPr>
+      <w:r>
+        <w:rPr>
+          <w:rStyle w:val="SubtleReference"/>
+        </w:rPr>
+        <w:t>Elite Troops</w:t>
+      </w:r>
+    </w:p>
+    <w:p>
+      <w:pPr>
+        <w:pStyle w:val="ListParagraph"/>
+        <w:numPr>
+          <w:ilvl w:val="1"/>
+          <w:numId w:val="8"/>
+        </w:numPr>
+      </w:pPr>
+      <w:r>
+        <w:rPr>
+          <w:rStyle w:val="SubtleReference"/>
+        </w:rPr>
+        <w:t>Eager Youth</w:t>
+      </w:r>
+    </w:p>
+    <w:p>
+      <w:pPr>
+        <w:pStyle w:val="ListParagraph"/>
+        <w:numPr>
+          <w:ilvl w:val="1"/>
+          <w:numId w:val="8"/>
+        </w:numPr>
+      </w:pPr>
+      <w:r>
+        <w:rPr>
+          <w:rStyle w:val="SubtleReference"/>
+        </w:rPr>
+        <w:t>Genius Commanders</w:t>
+      </w:r>
+    </w:p>
+    <w:p>
+      <w:pPr>
+        <w:pStyle w:val="ListParagraph"/>
+        <w:numPr>
+          <w:ilvl w:val="1"/>
+          <w:numId w:val="8"/>
+        </w:numPr>
+      </w:pPr>
+      <w:r>
+        <w:rPr>
+          <w:rStyle w:val="SubtleReference"/>
+        </w:rPr>
+        <w:t>Innovation Hub</w:t>
+      </w:r>
+    </w:p>
+    <w:p>
+      <w:pPr>
+        <w:pStyle w:val="ListParagraph"/>
+        <w:numPr>
+          <w:ilvl w:val="0"/>
+          <w:numId w:val="8"/>
+        </w:numPr>
+      </w:pPr>
+      <w:r>
+        <w:t>Place a non-player die</w:t>
+      </w:r>
+      <w:r>
+        <w:t>,</w:t>
+      </w:r>
+      <w:r>
+        <w:t xml:space="preserve"> with value 2</w:t>
+      </w:r>
+      <w:r>
+        <w:t>,</w:t>
+      </w:r>
+      <w:r>
+        <w:t xml:space="preserve"> on each of your Investments, denoting their level.</w:t>
+      </w:r>
+    </w:p>
+    <w:p>
+      <w:pPr>
+        <w:pStyle w:val="ListParagraph"/>
+        <w:numPr>
+          <w:ilvl w:val="0"/>
+          <w:numId w:val="8"/>
+        </w:numPr>
+      </w:pPr>
+      <w:r>
+        <w:t>Move four of your Leaders out in front of your Player Screen</w:t>
+      </w:r>
+      <w:r>
+        <w:t>, each with level 2</w:t>
+      </w:r>
+      <w:r>
+        <w:t xml:space="preserve">. </w:t>
+      </w:r>
+      <w:r>
+        <w:t>The rest of your Leaders cannot be used yet</w:t>
+      </w:r>
+      <w:r>
+        <w:t>.</w:t>
+      </w:r>
+    </w:p>
+    <w:p>
+      <w:pPr>
+        <w:pStyle w:val="ListParagraph"/>
+        <w:numPr>
+          <w:ilvl w:val="0"/>
+          <w:numId w:val="8"/>
+        </w:numPr>
+      </w:pPr>
+      <w:r>
+        <w:t xml:space="preserve">Find one copy of the following Law, place one of your Card Markers </w:t>
+      </w:r>
+      <w:r>
+        <w:t xml:space="preserve">on </w:t>
+      </w:r>
+      <w:r>
+        <w:t xml:space="preserve">the </w:t>
+      </w:r>
+      <w:r>
+        <w:t>top</w:t>
+      </w:r>
+      <w:r>
+        <w:t xml:space="preserve"> of the card, and place it face-up at the front of the Law Queue.</w:t>
+      </w:r>
+    </w:p>
+    <w:p>
+      <w:pPr>
+        <w:pStyle w:val="ListParagraph"/>
+        <w:numPr>
+          <w:ilvl w:val="1"/>
+          <w:numId w:val="8"/>
+        </w:numPr>
+      </w:pPr>
+      <w:r>
+        <w:rPr>
+          <w:rStyle w:val="SubtleReference"/>
+        </w:rPr>
+        <w:t>Police Force</w:t>
+      </w:r>
+    </w:p>
+    <w:p>
+      <w:pPr>
+        <w:pStyle w:val="ListParagraph"/>
+        <w:numPr>
+          <w:ilvl w:val="0"/>
+          <w:numId w:val="8"/>
+        </w:numPr>
+      </w:pPr>
+      <w:r>
+        <w:t>Find one copy of the following Investment and put it in your hand. Have the Master of Lies give you one less Investment card to star</w:t>
+      </w:r>
+      <w:r>
+        <w:t>t</w:t>
+      </w:r>
+      <w:r>
+        <w:t>.</w:t>
+      </w:r>
+    </w:p>
+    <w:p>
+      <w:pPr>
+        <w:pStyle w:val="ListParagraph"/>
+        <w:numPr>
+          <w:ilvl w:val="1"/>
+          <w:numId w:val="8"/>
+        </w:numPr>
+      </w:pPr>
+      <w:r>
+        <w:rPr>
+          <w:rStyle w:val="SubtleReference"/>
+        </w:rPr>
+        <w:t>Loyal Citizenry</w:t>
+      </w:r>
+    </w:p>
+    <w:p>
+      <w:pPr>
+        <w:pStyle w:val="Heading2"/>
+      </w:pPr>
+      <w:r>
+        <w:lastRenderedPageBreak/>
+        <w:t>Checkpoint</w:t>
+      </w:r>
+    </w:p>
+    <w:p>
+      <w:pPr>
+        <w:pStyle w:val="ListParagraph"/>
+        <w:numPr>
+          <w:ilvl w:val="0"/>
+          <w:numId w:val="9"/>
+        </w:numPr>
+      </w:pPr>
+      <w:r>
+        <w:t>Give 1 Troop per player to each player (</w:t>
+      </w:r>
+      <w:r>
+        <w:t>Each player in a</w:t>
+      </w:r>
+      <w:r>
+        <w:t xml:space="preserve"> 5-player game </w:t>
+      </w:r>
+      <w:r>
+        <w:t>should receive 5 Troops</w:t>
+      </w:r>
+      <w:r>
+        <w:t>).</w:t>
+      </w:r>
+    </w:p>
+    <w:p>
+      <w:pPr>
+        <w:pStyle w:val="Quote"/>
         <w:rPr>
           <w:rStyle w:val="Emphasis"/>
         </w:rPr>
-        <w:t xml:space="preserve">I </w:t>
-      </w:r>
-      <w:r>
+      </w:pPr>
+      <w:r>
+        <w:t>“</w:t>
+      </w:r>
+      <w:r>
+        <w:t>These are your starting Troops. Keep them in front of your screen since they are public information.</w:t>
+      </w:r>
+      <w:r>
+        <w:t>”</w:t>
+      </w:r>
+    </w:p>
+    <w:p>
+      <w:pPr>
+        <w:pStyle w:val="ListParagraph"/>
+        <w:numPr>
+          <w:ilvl w:val="0"/>
+          <w:numId w:val="9"/>
+        </w:numPr>
+      </w:pPr>
+      <w:r>
+        <w:t>Take the King’s Favor.</w:t>
+      </w:r>
+    </w:p>
+    <w:p>
+      <w:pPr>
+        <w:pStyle w:val="Quote"/>
         <w:rPr>
           <w:rStyle w:val="Emphasis"/>
         </w:rPr>
-        <w:t>know how to train</w:t>
-      </w:r>
-      <w:r>
-        <w:rPr>
-          <w:rStyle w:val="Emphasis"/>
-        </w:rPr>
-        <w:t xml:space="preserve"> lots of high-quality</w:t>
-      </w:r>
-      <w:r>
-        <w:rPr>
-          <w:rStyle w:val="Emphasis"/>
-        </w:rPr>
-        <w:t xml:space="preserve"> Troops</w:t>
-      </w:r>
-      <w:r>
-        <w:rPr>
-          <w:rStyle w:val="Emphasis"/>
-        </w:rPr>
-        <w:t xml:space="preserve"> and will use them to </w:t>
-      </w:r>
-      <w:r>
-        <w:rPr>
-          <w:rStyle w:val="Emphasis"/>
-        </w:rPr>
-        <w:t xml:space="preserve">make sure I always have </w:t>
-      </w:r>
-      <w:r>
-        <w:rPr>
-          <w:rStyle w:val="Emphasis"/>
-        </w:rPr>
-        <w:t>Coins.</w:t>
+      </w:pPr>
+      <w:r>
+        <w:t>“</w:t>
+      </w:r>
+      <w:r>
+        <w:t xml:space="preserve">This allows me to arbitrate all ties in the game and will give me one Honor at the end of the </w:t>
+      </w:r>
+      <w:r>
+        <w:t>game unless</w:t>
+      </w:r>
+      <w:r>
+        <w:t xml:space="preserve"> </w:t>
+      </w:r>
+      <w:r>
+        <w:t xml:space="preserve">someone takes it from me. </w:t>
+      </w:r>
+      <w:r>
+        <w:t xml:space="preserve">Normally, the oldest player (most honored) will start with </w:t>
+      </w:r>
+      <w:r>
+        <w:t>this.</w:t>
+      </w:r>
+      <w:r>
+        <w:t>”</w:t>
       </w:r>
     </w:p>
     <w:p>
@@ -99,293 +488,7 @@
         <w:pStyle w:val="ListParagraph"/>
         <w:numPr>
           <w:ilvl w:val="0"/>
-          <w:numId w:val="1"/>
-        </w:numPr>
-      </w:pPr>
-      <w:r>
-        <w:t>Choose a color then take the Player</w:t>
-      </w:r>
-      <w:r>
-        <w:t xml:space="preserve"> Screen</w:t>
-      </w:r>
-      <w:r>
-        <w:t xml:space="preserve">, </w:t>
-      </w:r>
-      <w:r>
-        <w:t>Leaders</w:t>
-      </w:r>
-      <w:r>
-        <w:t xml:space="preserve"> (dice)</w:t>
-      </w:r>
-      <w:r>
-        <w:t>, Alliance Tokens</w:t>
-      </w:r>
-      <w:r>
-        <w:t xml:space="preserve">, and </w:t>
-      </w:r>
-      <w:r>
-        <w:t>one Card Marker</w:t>
-      </w:r>
-      <w:r>
-        <w:t xml:space="preserve"> of your color.</w:t>
-      </w:r>
-      <w:r>
-        <w:t xml:space="preserve"> </w:t>
-      </w:r>
-      <w:r>
-        <w:t xml:space="preserve">Place everything </w:t>
-      </w:r>
-      <w:r>
-        <w:t>behind your Player Screen.</w:t>
-      </w:r>
-    </w:p>
-    <w:p>
-      <w:pPr>
-        <w:pStyle w:val="ListParagraph"/>
-        <w:numPr>
-          <w:ilvl w:val="0"/>
-          <w:numId w:val="1"/>
-        </w:numPr>
-      </w:pPr>
-      <w:r>
-        <w:t xml:space="preserve">Place one of your </w:t>
-      </w:r>
-      <w:r>
-        <w:t xml:space="preserve">Alliance Tokens </w:t>
-      </w:r>
-      <w:proofErr w:type="gramStart"/>
-      <w:r>
-        <w:t>on</w:t>
-      </w:r>
-      <w:proofErr w:type="gramEnd"/>
-      <w:r>
-        <w:t xml:space="preserve"> the start of the Honor Track.</w:t>
-      </w:r>
-    </w:p>
-    <w:p>
-      <w:pPr>
-        <w:pStyle w:val="ListParagraph"/>
-        <w:numPr>
-          <w:ilvl w:val="0"/>
-          <w:numId w:val="1"/>
-        </w:numPr>
-      </w:pPr>
-      <w:r>
-        <w:t>Keep one Alliance Token for each player (including yourself) and put the rest back in the box.</w:t>
-      </w:r>
-    </w:p>
-    <w:p>
-      <w:pPr>
-        <w:pStyle w:val="Heading2"/>
-      </w:pPr>
-      <w:r>
-        <w:t>Checkpoint</w:t>
-      </w:r>
-    </w:p>
-    <w:p>
-      <w:pPr>
-        <w:pStyle w:val="ListParagraph"/>
-        <w:numPr>
-          <w:ilvl w:val="0"/>
-          <w:numId w:val="2"/>
-        </w:numPr>
-      </w:pPr>
-      <w:r>
-        <w:t xml:space="preserve">Find </w:t>
-      </w:r>
-      <w:r>
-        <w:t xml:space="preserve">one copy of </w:t>
-      </w:r>
-      <w:r>
-        <w:t xml:space="preserve">the following Investments and put them </w:t>
-      </w:r>
-      <w:r>
-        <w:t>face-up</w:t>
-      </w:r>
-      <w:r>
-        <w:t xml:space="preserve"> in front of your Player</w:t>
-      </w:r>
-      <w:r>
-        <w:t xml:space="preserve"> Screen</w:t>
-      </w:r>
-      <w:r>
-        <w:t>:</w:t>
-      </w:r>
-    </w:p>
-    <w:p>
-      <w:pPr>
-        <w:pStyle w:val="ListParagraph"/>
-        <w:numPr>
-          <w:ilvl w:val="1"/>
-          <w:numId w:val="2"/>
-        </w:numPr>
-      </w:pPr>
-      <w:r>
-        <w:t>Elite Troops</w:t>
-      </w:r>
-    </w:p>
-    <w:p>
-      <w:pPr>
-        <w:pStyle w:val="ListParagraph"/>
-        <w:numPr>
-          <w:ilvl w:val="1"/>
-          <w:numId w:val="2"/>
-        </w:numPr>
-      </w:pPr>
-      <w:r>
-        <w:t>Eager Youth</w:t>
-      </w:r>
-    </w:p>
-    <w:p>
-      <w:pPr>
-        <w:pStyle w:val="ListParagraph"/>
-        <w:numPr>
-          <w:ilvl w:val="1"/>
-          <w:numId w:val="2"/>
-        </w:numPr>
-      </w:pPr>
-      <w:r>
-        <w:t>Genius Commanders</w:t>
-      </w:r>
-    </w:p>
-    <w:p>
-      <w:pPr>
-        <w:pStyle w:val="ListParagraph"/>
-        <w:numPr>
-          <w:ilvl w:val="1"/>
-          <w:numId w:val="2"/>
-        </w:numPr>
-      </w:pPr>
-      <w:r>
-        <w:t>Innovation Hub</w:t>
-      </w:r>
-    </w:p>
-    <w:p>
-      <w:pPr>
-        <w:pStyle w:val="ListParagraph"/>
-        <w:numPr>
-          <w:ilvl w:val="0"/>
-          <w:numId w:val="2"/>
-        </w:numPr>
-      </w:pPr>
-      <w:r>
-        <w:t>Place a non-player die</w:t>
-      </w:r>
-      <w:r>
-        <w:t>,</w:t>
-      </w:r>
-      <w:r>
-        <w:t xml:space="preserve"> with value 2</w:t>
-      </w:r>
-      <w:r>
-        <w:t>,</w:t>
-      </w:r>
-      <w:r>
-        <w:t xml:space="preserve"> on each of your </w:t>
-      </w:r>
-      <w:proofErr w:type="gramStart"/>
-      <w:r>
-        <w:t>Investments</w:t>
-      </w:r>
-      <w:proofErr w:type="gramEnd"/>
-      <w:r>
-        <w:t>, denoting their level.</w:t>
-      </w:r>
-    </w:p>
-    <w:p>
-      <w:pPr>
-        <w:pStyle w:val="ListParagraph"/>
-        <w:numPr>
-          <w:ilvl w:val="0"/>
-          <w:numId w:val="2"/>
-        </w:numPr>
-      </w:pPr>
-      <w:r>
-        <w:t>Move four of your Leaders out in front of your Player Screen</w:t>
-      </w:r>
-      <w:r>
-        <w:t>, each with level 2</w:t>
-      </w:r>
-      <w:r>
-        <w:t xml:space="preserve">. </w:t>
-      </w:r>
-      <w:r>
-        <w:t xml:space="preserve">The rest of your Leaders cannot </w:t>
-      </w:r>
-      <w:proofErr w:type="gramStart"/>
-      <w:r>
-        <w:t>be used</w:t>
-      </w:r>
-      <w:proofErr w:type="gramEnd"/>
-      <w:r>
-        <w:t xml:space="preserve"> yet</w:t>
-      </w:r>
-      <w:r>
-        <w:t>.</w:t>
-      </w:r>
-    </w:p>
-    <w:p>
-      <w:pPr>
-        <w:pStyle w:val="ListParagraph"/>
-        <w:numPr>
-          <w:ilvl w:val="0"/>
-          <w:numId w:val="2"/>
-        </w:numPr>
-      </w:pPr>
-      <w:r>
-        <w:t xml:space="preserve">Find one copy of the following Law, place one of your Card Markers </w:t>
-      </w:r>
-      <w:r>
-        <w:t xml:space="preserve">on </w:t>
-      </w:r>
-      <w:r>
-        <w:t xml:space="preserve">the </w:t>
-      </w:r>
-      <w:r>
-        <w:t>top</w:t>
-      </w:r>
-      <w:r>
-        <w:t xml:space="preserve"> of the card, and place it face-up at the front of the Law Queue.</w:t>
-      </w:r>
-    </w:p>
-    <w:p>
-      <w:pPr>
-        <w:pStyle w:val="Heading2"/>
-      </w:pPr>
-      <w:r>
-        <w:t>Checkpoint</w:t>
-      </w:r>
-    </w:p>
-    <w:p>
-      <w:pPr>
-        <w:pStyle w:val="ListParagraph"/>
-        <w:numPr>
-          <w:ilvl w:val="0"/>
-          <w:numId w:val="3"/>
-        </w:numPr>
-      </w:pPr>
-      <w:r>
-        <w:t>Give 1 Troop per player to each player (</w:t>
-      </w:r>
-      <w:r>
-        <w:t>Each player in a</w:t>
-      </w:r>
-      <w:r>
-        <w:t xml:space="preserve"> 5-player game </w:t>
-      </w:r>
-      <w:r>
-        <w:t>should receive 5 Troops</w:t>
-      </w:r>
-      <w:r>
-        <w:t>).</w:t>
-      </w:r>
-    </w:p>
-    <w:p>
-      <w:pPr>
-        <w:pStyle w:val="ListParagraph"/>
-        <w:numPr>
-          <w:ilvl w:val="1"/>
-          <w:numId w:val="3"/>
+          <w:numId w:val="9"/>
         </w:numPr>
         <w:rPr>
           <w:rStyle w:val="Emphasis"/>
@@ -396,138 +499,467 @@
       <w:r>
         <w:rPr>
           <w:rStyle w:val="Emphasis"/>
-        </w:rPr>
-        <w:t>These are your starting Troops. Keep them in front of your screen since they are public information.</w:t>
-      </w:r>
-    </w:p>
-    <w:p>
-      <w:pPr>
-        <w:pStyle w:val="ListParagraph"/>
-        <w:numPr>
-          <w:ilvl w:val="0"/>
-          <w:numId w:val="3"/>
-        </w:numPr>
-      </w:pPr>
-      <w:r>
-        <w:t>Take the King’s Favor.</w:t>
-      </w:r>
-    </w:p>
-    <w:p>
-      <w:pPr>
-        <w:pStyle w:val="ListParagraph"/>
-        <w:numPr>
-          <w:ilvl w:val="1"/>
-          <w:numId w:val="3"/>
-        </w:numPr>
-        <w:rPr>
-          <w:rStyle w:val="Emphasis"/>
-        </w:rPr>
-      </w:pPr>
-      <w:r>
-        <w:rPr>
-          <w:rStyle w:val="Emphasis"/>
-        </w:rPr>
-        <w:lastRenderedPageBreak/>
-        <w:t xml:space="preserve">This allows me to arbitrate all ties in the game and will give me one Honor at the end of the </w:t>
-      </w:r>
-      <w:r>
-        <w:rPr>
-          <w:rStyle w:val="Emphasis"/>
-        </w:rPr>
-        <w:t>game unless</w:t>
-      </w:r>
-      <w:r>
-        <w:rPr>
-          <w:rStyle w:val="Emphasis"/>
-        </w:rPr>
-        <w:t xml:space="preserve"> </w:t>
-      </w:r>
-      <w:r>
-        <w:rPr>
-          <w:rStyle w:val="Emphasis"/>
-        </w:rPr>
-        <w:t xml:space="preserve">someone takes it from me. </w:t>
-      </w:r>
-      <w:r>
-        <w:rPr>
-          <w:rStyle w:val="Emphasis"/>
-        </w:rPr>
-        <w:t xml:space="preserve">Normally, the oldest player (most honored) will start with </w:t>
-      </w:r>
-      <w:r>
-        <w:rPr>
-          <w:rStyle w:val="Emphasis"/>
-        </w:rPr>
-        <w:t>this.</w:t>
-      </w:r>
-    </w:p>
-    <w:p>
-      <w:pPr>
-        <w:pStyle w:val="ListParagraph"/>
-        <w:numPr>
-          <w:ilvl w:val="0"/>
-          <w:numId w:val="3"/>
-        </w:numPr>
+          <w:i w:val="0"/>
+          <w:iCs w:val="0"/>
+        </w:rPr>
+        <w:t>When the Chief Scribe prompts you, set the Deliberated Law to 2</w:t>
+      </w:r>
+      <w:r>
         <w:rPr>
           <w:rStyle w:val="Emphasis"/>
           <w:i w:val="0"/>
           <w:iCs w:val="0"/>
         </w:rPr>
-      </w:pPr>
-      <w:r>
+        <w:t>.</w:t>
+      </w:r>
+    </w:p>
+    <w:p>
+      <w:pPr>
+        <w:pStyle w:val="Quote"/>
+        <w:rPr>
+          <w:rStyle w:val="Emphasis"/>
+          <w:i/>
+          <w:iCs/>
+        </w:rPr>
+      </w:pPr>
+      <w:r>
+        <w:rPr>
+          <w:rStyle w:val="Emphasis"/>
+          <w:i/>
+          <w:iCs/>
+        </w:rPr>
+        <w:t xml:space="preserve">It’s not good to have fewer than 2 Troops, so </w:t>
+      </w:r>
+      <w:r>
+        <w:rPr>
+          <w:rStyle w:val="Emphasis"/>
+          <w:i/>
+          <w:iCs/>
+        </w:rPr>
+        <w:t>let’s make a rule about it.</w:t>
+      </w:r>
+    </w:p>
+    <w:p>
+      <w:pPr>
+        <w:pStyle w:val="Heading1"/>
         <w:rPr>
           <w:rStyle w:val="Emphasis"/>
           <w:i w:val="0"/>
           <w:iCs w:val="0"/>
         </w:rPr>
-        <w:t xml:space="preserve">When the Chief Scribe prompts you, set the Deliberated Law to </w:t>
-      </w:r>
-      <w:proofErr w:type="gramStart"/>
+      </w:pPr>
       <w:r>
         <w:rPr>
           <w:rStyle w:val="Emphasis"/>
           <w:i w:val="0"/>
           <w:iCs w:val="0"/>
         </w:rPr>
-        <w:t>2</w:t>
-      </w:r>
-      <w:proofErr w:type="gramEnd"/>
-      <w:r>
-        <w:rPr>
-          <w:rStyle w:val="Emphasis"/>
-          <w:i w:val="0"/>
-          <w:iCs w:val="0"/>
-        </w:rPr>
+        <w:t>Round 1</w:t>
+      </w:r>
+    </w:p>
+    <w:p>
+      <w:pPr>
+        <w:pStyle w:val="Heading2"/>
+      </w:pPr>
+      <w:r>
+        <w:t>Action Phase</w:t>
+      </w:r>
+    </w:p>
+    <w:p>
+      <w:pPr>
+        <w:pStyle w:val="Quote"/>
+      </w:pPr>
+      <w:r>
+        <w:t>I have the King’s Favor token, so I will start the round.</w:t>
+      </w:r>
+    </w:p>
+    <w:p>
+      <w:pPr>
+        <w:pStyle w:val="ListParagraph"/>
+        <w:numPr>
+          <w:ilvl w:val="0"/>
+          <w:numId w:val="10"/>
+        </w:numPr>
+      </w:pPr>
+      <w:r>
+        <w:rPr>
+          <w:rStyle w:val="Strong"/>
+        </w:rPr>
+        <w:t xml:space="preserve">Recruit </w:t>
+      </w:r>
+      <w:r>
+        <w:t xml:space="preserve">3 Troops with 2 Coins using </w:t>
+      </w:r>
+      <w:r>
+        <w:rPr>
+          <w:rStyle w:val="SubtleReference"/>
+        </w:rPr>
+        <w:t>Eager Youth</w:t>
+      </w:r>
+      <w:r>
         <w:t>.</w:t>
       </w:r>
     </w:p>
     <w:p>
       <w:pPr>
+        <w:pStyle w:val="Quote"/>
+      </w:pPr>
+      <w:r>
+        <w:t>I want to get some extra Troops</w:t>
+      </w:r>
+      <w:r>
+        <w:t xml:space="preserve"> to work with, so I will take the Recruit action. I have to pay 1 Coin per Troop, and I can buy </w:t>
+      </w:r>
+      <w:r>
+        <w:t>at most 2 Troops since the Leader I am using is Level 2.</w:t>
+      </w:r>
+      <w:r>
+        <w:t xml:space="preserve"> I will pay 2 Coins to the Free Bank</w:t>
+      </w:r>
+      <w:r>
+        <w:t xml:space="preserve"> for 2 Troops.</w:t>
+      </w:r>
+      <w:r>
+        <w:t xml:space="preserve"> I also have an Investment</w:t>
+      </w:r>
+      <w:r>
+        <w:t xml:space="preserve"> (Eager Youth) that gives me a free Troop after I Recruit every 2 Troops</w:t>
+      </w:r>
+      <w:r>
+        <w:t>, so I get another, for a total of 3 Troops.</w:t>
+      </w:r>
+    </w:p>
+    <w:p>
+      <w:pPr>
+        <w:pStyle w:val="ListParagraph"/>
+        <w:numPr>
+          <w:ilvl w:val="0"/>
+          <w:numId w:val="10"/>
+        </w:numPr>
+      </w:pPr>
+      <w:r>
+        <w:rPr>
+          <w:rStyle w:val="Strong"/>
+        </w:rPr>
+        <w:t xml:space="preserve">Deploy </w:t>
+      </w:r>
+      <w:r>
+        <w:t>2 Troops for 3 Coins.</w:t>
+      </w:r>
+    </w:p>
+    <w:p>
+      <w:pPr>
+        <w:pStyle w:val="Quote"/>
+      </w:pPr>
+      <w:r>
+        <w:t>I will also Deploy some Troops, but my Troops are much better than the rest of yours (Elite Troops), so I get 2 extra Coins from the Royal Bank.</w:t>
+      </w:r>
+    </w:p>
+    <w:p>
+      <w:pPr>
+        <w:pStyle w:val="ListParagraph"/>
+        <w:numPr>
+          <w:ilvl w:val="0"/>
+          <w:numId w:val="10"/>
+        </w:numPr>
+        <w:rPr>
+          <w:rStyle w:val="SubtleReference"/>
+          <w:b/>
+          <w:bCs/>
+          <w:smallCaps w:val="0"/>
+          <w:color w:val="auto"/>
+        </w:rPr>
+      </w:pPr>
+      <w:r>
+        <w:rPr>
+          <w:rStyle w:val="Strong"/>
+        </w:rPr>
+        <w:t xml:space="preserve">Brainstorm </w:t>
+      </w:r>
+      <w:r>
+        <w:t xml:space="preserve">for 2 cards from each deck and 2 extra Investments for </w:t>
+      </w:r>
+      <w:r>
+        <w:rPr>
+          <w:rStyle w:val="SubtleReference"/>
+        </w:rPr>
+        <w:t>Genius Commanders</w:t>
+      </w:r>
+      <w:r>
+        <w:rPr>
+          <w:rStyle w:val="SubtleReference"/>
+        </w:rPr>
+        <w:t>.</w:t>
+      </w:r>
+    </w:p>
+    <w:p>
+      <w:pPr>
+        <w:pStyle w:val="Quote"/>
+      </w:pPr>
+      <w:r>
+        <w:t>I also want some more Cards, but I have a card that gives me 2 extra cards of my choice</w:t>
+      </w:r>
+      <w:r>
+        <w:t xml:space="preserve"> </w:t>
+      </w:r>
+      <w:r>
+        <w:t>(Genius Commanders), so I will get 2 from each deck plus 2 more Investment cards.</w:t>
+      </w:r>
+    </w:p>
+    <w:p>
+      <w:pPr>
+        <w:pStyle w:val="ListParagraph"/>
+        <w:numPr>
+          <w:ilvl w:val="0"/>
+          <w:numId w:val="10"/>
+        </w:numPr>
+        <w:rPr>
+          <w:rStyle w:val="Strong"/>
+          <w:b w:val="0"/>
+          <w:bCs w:val="0"/>
+        </w:rPr>
+      </w:pPr>
+      <w:r>
+        <w:t xml:space="preserve">Private </w:t>
+      </w:r>
+      <w:r>
+        <w:rPr>
+          <w:rStyle w:val="Strong"/>
+        </w:rPr>
+        <w:t>Monetize</w:t>
+      </w:r>
+      <w:r>
+        <w:rPr>
+          <w:rStyle w:val="Strong"/>
+          <w:b w:val="0"/>
+          <w:bCs w:val="0"/>
+        </w:rPr>
+        <w:t xml:space="preserve"> 3 Scheme and 3 Law cards for 2 Coins</w:t>
+      </w:r>
+      <w:r>
+        <w:rPr>
+          <w:rStyle w:val="Strong"/>
+          <w:b w:val="0"/>
+          <w:bCs w:val="0"/>
+        </w:rPr>
+        <w:t xml:space="preserve"> using </w:t>
+      </w:r>
+      <w:r>
+        <w:rPr>
+          <w:rStyle w:val="SubtleReference"/>
+        </w:rPr>
+        <w:t>Innovation Hub</w:t>
+      </w:r>
+      <w:r>
+        <w:rPr>
+          <w:rStyle w:val="Strong"/>
+          <w:b w:val="0"/>
+          <w:bCs w:val="0"/>
+        </w:rPr>
+        <w:t>.</w:t>
+      </w:r>
+    </w:p>
+    <w:p>
+      <w:pPr>
+        <w:pStyle w:val="Quote"/>
+        <w:rPr>
+          <w:rStyle w:val="Strong"/>
+          <w:b w:val="0"/>
+          <w:bCs w:val="0"/>
+        </w:rPr>
+      </w:pPr>
+      <w:r>
+        <w:rPr>
+          <w:rStyle w:val="Strong"/>
+          <w:b w:val="0"/>
+          <w:bCs w:val="0"/>
+        </w:rPr>
+        <w:lastRenderedPageBreak/>
+        <w:t xml:space="preserve">I also want to Monetize, but </w:t>
+      </w:r>
+      <w:r>
+        <w:rPr>
+          <w:rStyle w:val="Strong"/>
+          <w:b w:val="0"/>
+          <w:bCs w:val="0"/>
+        </w:rPr>
+        <w:t xml:space="preserve">the Master of Lies already used the Court Monetize, so I will use my own Monetize action </w:t>
+      </w:r>
+      <w:r>
+        <w:rPr>
+          <w:rStyle w:val="Strong"/>
+          <w:b w:val="0"/>
+          <w:bCs w:val="0"/>
+        </w:rPr>
+        <w:t>(Innovation Hub). It gives me a better rate than the Court, so I would have used this one anyway.</w:t>
+      </w:r>
+    </w:p>
+    <w:p>
+      <w:pPr>
+        <w:pStyle w:val="Heading2"/>
+      </w:pPr>
+      <w:r>
+        <w:t>Report Phase</w:t>
+      </w:r>
+    </w:p>
+    <w:p>
+      <w:pPr>
+        <w:pStyle w:val="ListParagraph"/>
+        <w:numPr>
+          <w:ilvl w:val="0"/>
+          <w:numId w:val="6"/>
+        </w:numPr>
+      </w:pPr>
+      <w:r>
+        <w:t>After the battle is over</w:t>
+      </w:r>
+      <w:r>
+        <w:t>,</w:t>
+      </w:r>
+    </w:p>
+    <w:p>
+      <w:pPr>
+        <w:pStyle w:val="Quote"/>
+      </w:pPr>
+      <w:r>
+        <w:t>“Everyone</w:t>
+      </w:r>
+      <w:r>
+        <w:t xml:space="preserve"> take your Leaders back. Make sure to not change their values!”</w:t>
+      </w:r>
+    </w:p>
+    <w:p>
+      <w:pPr>
         <w:pStyle w:val="Heading1"/>
-        <w:rPr>
-          <w:rStyle w:val="Emphasis"/>
-          <w:i w:val="0"/>
-          <w:iCs w:val="0"/>
-        </w:rPr>
-      </w:pPr>
-      <w:r>
-        <w:rPr>
-          <w:rStyle w:val="Emphasis"/>
-          <w:i w:val="0"/>
-          <w:iCs w:val="0"/>
-        </w:rPr>
-        <w:t xml:space="preserve">Round </w:t>
-      </w:r>
-      <w:proofErr w:type="gramStart"/>
-      <w:r>
-        <w:rPr>
-          <w:rStyle w:val="Emphasis"/>
-          <w:i w:val="0"/>
-          <w:iCs w:val="0"/>
-        </w:rPr>
-        <w:t>1</w:t>
-      </w:r>
-      <w:proofErr w:type="gramEnd"/>
+      </w:pPr>
+      <w:r>
+        <w:t>Round 2</w:t>
+      </w:r>
+    </w:p>
+    <w:p>
+      <w:pPr>
+        <w:pStyle w:val="Heading2"/>
+      </w:pPr>
+      <w:r>
+        <w:t>Action Phase</w:t>
+      </w:r>
+    </w:p>
+    <w:p>
+      <w:pPr>
+        <w:pStyle w:val="ListParagraph"/>
+        <w:numPr>
+          <w:ilvl w:val="0"/>
+          <w:numId w:val="5"/>
+        </w:numPr>
+      </w:pPr>
+      <w:r>
+        <w:rPr>
+          <w:rStyle w:val="Strong"/>
+        </w:rPr>
+        <w:t>Promote</w:t>
+      </w:r>
+      <w:r>
+        <w:t xml:space="preserve"> a Leader to Level 3.</w:t>
+      </w:r>
+    </w:p>
+    <w:p>
+      <w:pPr>
+        <w:pStyle w:val="ListParagraph"/>
+        <w:numPr>
+          <w:ilvl w:val="0"/>
+          <w:numId w:val="5"/>
+        </w:numPr>
+      </w:pPr>
+      <w:r>
+        <w:rPr>
+          <w:rStyle w:val="Strong"/>
+        </w:rPr>
+        <w:t xml:space="preserve">Harvest </w:t>
+      </w:r>
+      <w:r>
+        <w:t>4 Commodities.</w:t>
+      </w:r>
+    </w:p>
+    <w:p>
+      <w:pPr>
+        <w:pStyle w:val="Quote"/>
+      </w:pPr>
+      <w:r>
+        <w:t>I need some Commodities, but I’m not a fan of that Market Rate, so I will just get them for free.</w:t>
+      </w:r>
+    </w:p>
+    <w:p>
+      <w:pPr>
+        <w:pStyle w:val="ListParagraph"/>
+        <w:numPr>
+          <w:ilvl w:val="0"/>
+          <w:numId w:val="5"/>
+        </w:numPr>
+      </w:pPr>
+      <w:r>
+        <w:rPr>
+          <w:rStyle w:val="Strong"/>
+        </w:rPr>
+        <w:t xml:space="preserve">Deploy </w:t>
+      </w:r>
+      <w:r>
+        <w:t>2 Troops.</w:t>
+      </w:r>
+    </w:p>
+    <w:p>
+      <w:pPr>
+        <w:pStyle w:val="ListParagraph"/>
+        <w:numPr>
+          <w:ilvl w:val="0"/>
+          <w:numId w:val="5"/>
+        </w:numPr>
+      </w:pPr>
+      <w:r>
+        <w:rPr>
+          <w:rStyle w:val="Strong"/>
+        </w:rPr>
+        <w:t xml:space="preserve">Build </w:t>
+      </w:r>
+      <w:r>
+        <w:t>Level 2 Investment (</w:t>
+      </w:r>
+      <w:r>
+        <w:rPr>
+          <w:rStyle w:val="SubtleReference"/>
+        </w:rPr>
+        <w:t>Loyal Citizenry</w:t>
+      </w:r>
+      <w:r>
+        <w:t>)</w:t>
+      </w:r>
+      <w:r>
+        <w:t>.</w:t>
+      </w:r>
+    </w:p>
+    <w:p>
+      <w:pPr>
+        <w:pStyle w:val="Quote"/>
+      </w:pPr>
+      <w:r>
+        <w:t>I want to play an Investment from my hand, so I will use the Build action</w:t>
+      </w:r>
+      <w:r>
+        <w:t>. This new Investment can be at most Level 2 since I used a Level 2 Leader, but I also have to pay 1 Commodity for each level I want to give it</w:t>
+      </w:r>
+      <w:r>
+        <w:t>, just like the Upgrade action</w:t>
+      </w:r>
+      <w:r>
+        <w:t>. I will build it at Level 2 and pay 2 Commodities.</w:t>
+      </w:r>
+    </w:p>
+    <w:p>
+      <w:pPr>
+        <w:pStyle w:val="Heading2"/>
+      </w:pPr>
+      <w:r>
+        <w:t>Report Phase</w:t>
+      </w:r>
     </w:p>
     <w:p>
       <w:pPr>
@@ -537,6 +969,300 @@
           <w:numId w:val="4"/>
         </w:numPr>
       </w:pPr>
+      <w:r>
+        <w:t>After the battle is over,</w:t>
+      </w:r>
+    </w:p>
+    <w:p>
+      <w:pPr>
+        <w:pStyle w:val="Quote"/>
+      </w:pPr>
+      <w:r>
+        <w:t>“Everyone take your Leaders back. Make sure to not change their values!”</w:t>
+      </w:r>
+    </w:p>
+    <w:p>
+      <w:pPr>
+        <w:pStyle w:val="Heading1"/>
+      </w:pPr>
+      <w:r>
+        <w:t>Round 3</w:t>
+      </w:r>
+    </w:p>
+    <w:p>
+      <w:pPr>
+        <w:pStyle w:val="Heading2"/>
+      </w:pPr>
+      <w:r>
+        <w:t>Action Phase</w:t>
+      </w:r>
+    </w:p>
+    <w:p>
+      <w:pPr>
+        <w:pStyle w:val="ListParagraph"/>
+        <w:numPr>
+          <w:ilvl w:val="0"/>
+          <w:numId w:val="3"/>
+        </w:numPr>
+      </w:pPr>
+      <w:r>
+        <w:t>At some point in the next round,</w:t>
+      </w:r>
+      <w:r>
+        <w:t xml:space="preserve"> </w:t>
+      </w:r>
+      <w:r>
+        <w:t>subtly</w:t>
+      </w:r>
+      <w:r>
+        <w:t xml:space="preserve"> </w:t>
+      </w:r>
+      <w:r>
+        <w:rPr>
+          <w:rStyle w:val="Strong"/>
+        </w:rPr>
+        <w:t>scheme</w:t>
+      </w:r>
+      <w:r>
+        <w:t xml:space="preserve"> against the Head Banker with yourself as the Receiver.</w:t>
+      </w:r>
+      <w:r>
+        <w:t xml:space="preserve"> </w:t>
+      </w:r>
+    </w:p>
+    <w:p>
+      <w:pPr>
+        <w:pStyle w:val="ListParagraph"/>
+        <w:numPr>
+          <w:ilvl w:val="1"/>
+          <w:numId w:val="3"/>
+        </w:numPr>
+      </w:pPr>
+      <w:r>
+        <w:t>C</w:t>
+      </w:r>
+      <w:r>
+        <w:t xml:space="preserve">hoose a scheme card </w:t>
+      </w:r>
+      <w:r>
+        <w:t xml:space="preserve">that has a “$R” </w:t>
+      </w:r>
+      <w:r>
+        <w:t>from your hand</w:t>
+      </w:r>
+      <w:r>
+        <w:t xml:space="preserve"> and grab </w:t>
+      </w:r>
+      <w:r>
+        <w:t>a card marker for the Head Banker and one of your own</w:t>
+      </w:r>
+      <w:r>
+        <w:t>.</w:t>
+      </w:r>
+    </w:p>
+    <w:p>
+      <w:pPr>
+        <w:pStyle w:val="ListParagraph"/>
+        <w:numPr>
+          <w:ilvl w:val="1"/>
+          <w:numId w:val="3"/>
+        </w:numPr>
+      </w:pPr>
+      <w:r>
+        <w:lastRenderedPageBreak/>
+        <w:t>P</w:t>
+      </w:r>
+      <w:r>
+        <w:t>ut the Head Banker’s card marker on the top of the scheme card</w:t>
+      </w:r>
+      <w:r>
+        <w:t xml:space="preserve"> and yours on the bottom.</w:t>
+      </w:r>
+    </w:p>
+    <w:p>
+      <w:pPr>
+        <w:pStyle w:val="ListParagraph"/>
+        <w:numPr>
+          <w:ilvl w:val="1"/>
+          <w:numId w:val="3"/>
+        </w:numPr>
+      </w:pPr>
+      <w:r>
+        <w:t xml:space="preserve">Put the marked scheme card back into the </w:t>
+      </w:r>
+      <w:r>
+        <w:t xml:space="preserve">pouch </w:t>
+      </w:r>
+      <w:r>
+        <w:t xml:space="preserve">with all the rest of </w:t>
+      </w:r>
+      <w:r>
+        <w:t>the card markers.</w:t>
+      </w:r>
+    </w:p>
+    <w:p>
+      <w:pPr>
+        <w:pStyle w:val="ListParagraph"/>
+        <w:numPr>
+          <w:ilvl w:val="1"/>
+          <w:numId w:val="3"/>
+        </w:numPr>
+      </w:pPr>
+      <w:r>
+        <w:t>Put your Spy into the pouch.</w:t>
+      </w:r>
+    </w:p>
+    <w:p>
+      <w:pPr>
+        <w:pStyle w:val="ListParagraph"/>
+      </w:pPr>
+    </w:p>
+    <w:p>
+      <w:pPr>
+        <w:pStyle w:val="ListParagraph"/>
+        <w:numPr>
+          <w:ilvl w:val="0"/>
+          <w:numId w:val="2"/>
+        </w:numPr>
+      </w:pPr>
+      <w:r>
+        <w:rPr>
+          <w:rStyle w:val="Strong"/>
+        </w:rPr>
+        <w:t>Deploy</w:t>
+      </w:r>
+    </w:p>
+    <w:p>
+      <w:pPr>
+        <w:pStyle w:val="ListParagraph"/>
+        <w:numPr>
+          <w:ilvl w:val="0"/>
+          <w:numId w:val="2"/>
+        </w:numPr>
+      </w:pPr>
+      <w:r>
+        <w:rPr>
+          <w:rStyle w:val="Strong"/>
+        </w:rPr>
+        <w:t>Recruit</w:t>
+      </w:r>
+    </w:p>
+    <w:p>
+      <w:pPr>
+        <w:pStyle w:val="ListParagraph"/>
+        <w:numPr>
+          <w:ilvl w:val="1"/>
+          <w:numId w:val="2"/>
+        </w:numPr>
+      </w:pPr>
+      <w:r>
+        <w:t xml:space="preserve">After finishing this action, trade your </w:t>
+      </w:r>
+      <w:r>
+        <w:rPr>
+          <w:rStyle w:val="SubtleReference"/>
+        </w:rPr>
+        <w:t>Eager Youth</w:t>
+      </w:r>
+      <w:r>
+        <w:t xml:space="preserve"> with the Chief Scribe in return for his </w:t>
+      </w:r>
+      <w:r>
+        <w:rPr>
+          <w:rStyle w:val="SubtleReference"/>
+        </w:rPr>
+        <w:t>Undeniable Advisors</w:t>
+      </w:r>
+      <w:r>
+        <w:t xml:space="preserve">. Return one </w:t>
+      </w:r>
+      <w:r>
+        <w:t>Alliance Token to the Chief Scribe to make this trade.</w:t>
+      </w:r>
+    </w:p>
+    <w:p>
+      <w:pPr>
+        <w:pStyle w:val="Quote"/>
+      </w:pPr>
+      <w:r>
+        <w:t xml:space="preserve">These Alliance Tokens allow Allies to trade non-liquid </w:t>
+      </w:r>
+      <w:r>
+        <w:t xml:space="preserve">assets. </w:t>
+      </w:r>
+      <w:r>
+        <w:t xml:space="preserve">Players can trade </w:t>
+      </w:r>
+      <w:r>
+        <w:t>liquid assets</w:t>
+      </w:r>
+      <w:r>
+        <w:t xml:space="preserve"> (Coins and Commodities)</w:t>
+      </w:r>
+      <w:r>
+        <w:t xml:space="preserve"> at any time</w:t>
+      </w:r>
+      <w:r>
+        <w:t>, even outside their turn</w:t>
+      </w:r>
+      <w:r>
+        <w:t xml:space="preserve">, but anything else can only be traded by returning </w:t>
+      </w:r>
+      <w:r>
+        <w:t xml:space="preserve">Alliance Tokens. </w:t>
+      </w:r>
+      <w:r>
+        <w:t xml:space="preserve">I won’t need this Eager Youth anymore, but I would love </w:t>
+      </w:r>
+      <w:r>
+        <w:t>to Donate using the Chief Scribe’s Undeniable Advisors, so we are going to trade.</w:t>
+      </w:r>
+    </w:p>
+    <w:p>
+      <w:pPr>
+        <w:pStyle w:val="ListParagraph"/>
+        <w:numPr>
+          <w:ilvl w:val="0"/>
+          <w:numId w:val="2"/>
+        </w:numPr>
+      </w:pPr>
+      <w:r>
+        <w:t xml:space="preserve">Private </w:t>
+      </w:r>
+      <w:r>
+        <w:rPr>
+          <w:rStyle w:val="Strong"/>
+        </w:rPr>
+        <w:t>Monetize</w:t>
+      </w:r>
+    </w:p>
+    <w:p>
+      <w:pPr>
+        <w:pStyle w:val="Heading2"/>
+      </w:pPr>
+      <w:r>
+        <w:t>Report Phase</w:t>
+      </w:r>
+    </w:p>
+    <w:p>
+      <w:pPr>
+        <w:pStyle w:val="ListParagraph"/>
+        <w:numPr>
+          <w:ilvl w:val="0"/>
+          <w:numId w:val="1"/>
+        </w:numPr>
+      </w:pPr>
+      <w:r>
+        <w:t>After the battle is over,</w:t>
+      </w:r>
+    </w:p>
+    <w:p>
+      <w:pPr>
+        <w:pStyle w:val="Quote"/>
+      </w:pPr>
+      <w:r>
+        <w:t>“Everyone take your Leaders back. Make sure to not change their values!”</w:t>
+      </w:r>
     </w:p>
     <w:sectPr>
       <w:pgSz w:w="12240" w:h="15840"/>
@@ -551,6 +1277,264 @@
 <file path=word/numbering.xml><?xml version="1.0" encoding="utf-8"?>
 <w:numbering xmlns:wpc="http://schemas.microsoft.com/office/word/2010/wordprocessingCanvas" xmlns:cx="http://schemas.microsoft.com/office/drawing/2014/chartex" xmlns:cx1="http://schemas.microsoft.com/office/drawing/2015/9/8/chartex" xmlns:cx2="http://schemas.microsoft.com/office/drawing/2015/10/21/chartex" xmlns:cx3="http://schemas.microsoft.com/office/drawing/2016/5/9/chartex" xmlns:cx4="http://schemas.microsoft.com/office/drawing/2016/5/10/chartex" xmlns:cx5="http://schemas.microsoft.com/office/drawing/2016/5/11/chartex" xmlns:cx6="http://schemas.microsoft.com/office/drawing/2016/5/12/chartex" xmlns:cx7="http://schemas.microsoft.com/office/drawing/2016/5/13/chartex" xmlns:cx8="http://schemas.microsoft.com/office/drawing/2016/5/14/chartex" xmlns:mc="http://schemas.openxmlformats.org/markup-compatibility/2006" xmlns:aink="http://schemas.microsoft.com/office/drawing/2016/ink" xmlns:am3d="http://schemas.microsoft.com/office/drawing/2017/model3d" xmlns:o="urn:schemas-microsoft-com:office:office" xmlns:oel="http://schemas.microsoft.com/office/2019/extlst" xmlns:r="http://schemas.openxmlformats.org/officeDocument/2006/relationships" xmlns:m="http://schemas.openxmlformats.org/officeDocument/2006/math" xmlns:v="urn:schemas-microsoft-com:vml" xmlns:wp14="http://schemas.microsoft.com/office/word/2010/wordprocessingDrawing" xmlns:wp="http://schemas.openxmlformats.org/drawingml/2006/wordprocessingDrawing" xmlns:w10="urn:schemas-microsoft-com:office:word" xmlns:w="http://schemas.openxmlformats.org/wordprocessingml/2006/main" xmlns:w14="http://schemas.microsoft.com/office/word/2010/wordml" xmlns:w15="http://schemas.microsoft.com/office/word/2012/wordml" xmlns:w16cex="http://schemas.microsoft.com/office/word/2018/wordml/cex" xmlns:w16cid="http://schemas.microsoft.com/office/word/2016/wordml/cid" xmlns:w16="http://schemas.microsoft.com/office/word/2018/wordml" xmlns:w16du="http://schemas.microsoft.com/office/word/2023/wordml/word16du" xmlns:w16sdtdh="http://schemas.microsoft.com/office/word/2020/wordml/sdtdatahash" xmlns:w16sdtfl="http://schemas.microsoft.com/office/word/2024/wordml/sdtformatlock" xmlns:w16se="http://schemas.microsoft.com/office/word/2015/wordml/symex" xmlns:wpg="http://schemas.microsoft.com/office/word/2010/wordprocessingGroup" xmlns:wpi="http://schemas.microsoft.com/office/word/2010/wordprocessingInk" xmlns:wne="http://schemas.microsoft.com/office/word/2006/wordml" xmlns:wps="http://schemas.microsoft.com/office/word/2010/wordprocessingShape" mc:Ignorable="w14 w15 w16se w16cid w16 w16cex w16sdtdh w16sdtfl w16du wp14">
   <w:abstractNum w:abstractNumId="0" w15:restartNumberingAfterBreak="0">
+    <w:nsid w:val="01887992"/>
+    <w:multiLevelType w:val="hybridMultilevel"/>
+    <w:tmpl w:val="D7347BC8"/>
+    <w:lvl w:ilvl="0" w:tplc="2D9AFA60">
+      <w:start w:val="1"/>
+      <w:numFmt w:val="decimal"/>
+      <w:lvlText w:val="%1."/>
+      <w:lvlJc w:val="left"/>
+      <w:pPr>
+        <w:ind w:left="720" w:hanging="360"/>
+      </w:pPr>
+    </w:lvl>
+    <w:lvl w:ilvl="1" w:tplc="C90A1680">
+      <w:start w:val="1"/>
+      <w:numFmt w:val="lowerLetter"/>
+      <w:lvlText w:val="%2."/>
+      <w:lvlJc w:val="left"/>
+      <w:pPr>
+        <w:ind w:left="1440" w:hanging="360"/>
+      </w:pPr>
+    </w:lvl>
+    <w:lvl w:ilvl="2" w:tplc="8DF67A38">
+      <w:start w:val="1"/>
+      <w:numFmt w:val="lowerRoman"/>
+      <w:lvlText w:val="%3."/>
+      <w:lvlJc w:val="right"/>
+      <w:pPr>
+        <w:ind w:left="2160" w:hanging="180"/>
+      </w:pPr>
+    </w:lvl>
+    <w:lvl w:ilvl="3" w:tplc="5A806022">
+      <w:start w:val="1"/>
+      <w:numFmt w:val="decimal"/>
+      <w:lvlText w:val="%4."/>
+      <w:lvlJc w:val="left"/>
+      <w:pPr>
+        <w:ind w:left="2880" w:hanging="360"/>
+      </w:pPr>
+    </w:lvl>
+    <w:lvl w:ilvl="4" w:tplc="670A8250">
+      <w:start w:val="1"/>
+      <w:numFmt w:val="lowerLetter"/>
+      <w:lvlText w:val="%5."/>
+      <w:lvlJc w:val="left"/>
+      <w:pPr>
+        <w:ind w:left="3600" w:hanging="360"/>
+      </w:pPr>
+    </w:lvl>
+    <w:lvl w:ilvl="5" w:tplc="9FB0CF8A">
+      <w:start w:val="1"/>
+      <w:numFmt w:val="lowerRoman"/>
+      <w:lvlText w:val="%6."/>
+      <w:lvlJc w:val="right"/>
+      <w:pPr>
+        <w:ind w:left="4320" w:hanging="180"/>
+      </w:pPr>
+    </w:lvl>
+    <w:lvl w:ilvl="6" w:tplc="7BC240CE">
+      <w:start w:val="1"/>
+      <w:numFmt w:val="decimal"/>
+      <w:lvlText w:val="%7."/>
+      <w:lvlJc w:val="left"/>
+      <w:pPr>
+        <w:ind w:left="5040" w:hanging="360"/>
+      </w:pPr>
+    </w:lvl>
+    <w:lvl w:ilvl="7" w:tplc="8B50F618">
+      <w:start w:val="1"/>
+      <w:numFmt w:val="lowerLetter"/>
+      <w:lvlText w:val="%8."/>
+      <w:lvlJc w:val="left"/>
+      <w:pPr>
+        <w:ind w:left="5760" w:hanging="360"/>
+      </w:pPr>
+    </w:lvl>
+    <w:lvl w:ilvl="8" w:tplc="7C02F2B8">
+      <w:start w:val="1"/>
+      <w:numFmt w:val="lowerRoman"/>
+      <w:lvlText w:val="%9."/>
+      <w:lvlJc w:val="right"/>
+      <w:pPr>
+        <w:ind w:left="6480" w:hanging="180"/>
+      </w:pPr>
+    </w:lvl>
+  </w:abstractNum>
+  <w:abstractNum w:abstractNumId="1" w15:restartNumberingAfterBreak="0">
+    <w:nsid w:val="0561378F"/>
+    <w:multiLevelType w:val="hybridMultilevel"/>
+    <w:tmpl w:val="FCE0CD5C"/>
+    <w:lvl w:ilvl="0" w:tplc="B61CBDDE">
+      <w:start w:val="1"/>
+      <w:numFmt w:val="decimal"/>
+      <w:lvlText w:val="%1."/>
+      <w:lvlJc w:val="left"/>
+      <w:pPr>
+        <w:ind w:left="720" w:hanging="360"/>
+      </w:pPr>
+    </w:lvl>
+    <w:lvl w:ilvl="1" w:tplc="9DCE9592">
+      <w:start w:val="1"/>
+      <w:numFmt w:val="lowerLetter"/>
+      <w:lvlText w:val="%2."/>
+      <w:lvlJc w:val="left"/>
+      <w:pPr>
+        <w:ind w:left="1440" w:hanging="360"/>
+      </w:pPr>
+    </w:lvl>
+    <w:lvl w:ilvl="2" w:tplc="6D98D8FC">
+      <w:start w:val="1"/>
+      <w:numFmt w:val="lowerRoman"/>
+      <w:lvlText w:val="%3."/>
+      <w:lvlJc w:val="right"/>
+      <w:pPr>
+        <w:ind w:left="2160" w:hanging="180"/>
+      </w:pPr>
+    </w:lvl>
+    <w:lvl w:ilvl="3" w:tplc="ECA29CEC">
+      <w:start w:val="1"/>
+      <w:numFmt w:val="decimal"/>
+      <w:lvlText w:val="%4."/>
+      <w:lvlJc w:val="left"/>
+      <w:pPr>
+        <w:ind w:left="2880" w:hanging="360"/>
+      </w:pPr>
+    </w:lvl>
+    <w:lvl w:ilvl="4" w:tplc="9F6C586C">
+      <w:start w:val="1"/>
+      <w:numFmt w:val="lowerLetter"/>
+      <w:lvlText w:val="%5."/>
+      <w:lvlJc w:val="left"/>
+      <w:pPr>
+        <w:ind w:left="3600" w:hanging="360"/>
+      </w:pPr>
+    </w:lvl>
+    <w:lvl w:ilvl="5" w:tplc="82080F44">
+      <w:start w:val="1"/>
+      <w:numFmt w:val="lowerRoman"/>
+      <w:lvlText w:val="%6."/>
+      <w:lvlJc w:val="right"/>
+      <w:pPr>
+        <w:ind w:left="4320" w:hanging="180"/>
+      </w:pPr>
+    </w:lvl>
+    <w:lvl w:ilvl="6" w:tplc="FA984C9A">
+      <w:start w:val="1"/>
+      <w:numFmt w:val="decimal"/>
+      <w:lvlText w:val="%7."/>
+      <w:lvlJc w:val="left"/>
+      <w:pPr>
+        <w:ind w:left="5040" w:hanging="360"/>
+      </w:pPr>
+    </w:lvl>
+    <w:lvl w:ilvl="7" w:tplc="22D2468E">
+      <w:start w:val="1"/>
+      <w:numFmt w:val="lowerLetter"/>
+      <w:lvlText w:val="%8."/>
+      <w:lvlJc w:val="left"/>
+      <w:pPr>
+        <w:ind w:left="5760" w:hanging="360"/>
+      </w:pPr>
+    </w:lvl>
+    <w:lvl w:ilvl="8" w:tplc="478076C4">
+      <w:start w:val="1"/>
+      <w:numFmt w:val="lowerRoman"/>
+      <w:lvlText w:val="%9."/>
+      <w:lvlJc w:val="right"/>
+      <w:pPr>
+        <w:ind w:left="6480" w:hanging="180"/>
+      </w:pPr>
+    </w:lvl>
+  </w:abstractNum>
+  <w:abstractNum w:abstractNumId="2" w15:restartNumberingAfterBreak="0">
+    <w:nsid w:val="3C6D4415"/>
+    <w:multiLevelType w:val="hybridMultilevel"/>
+    <w:tmpl w:val="2EB65FD4"/>
+    <w:lvl w:ilvl="0" w:tplc="E3467F0A">
+      <w:start w:val="1"/>
+      <w:numFmt w:val="decimal"/>
+      <w:lvlText w:val="%1."/>
+      <w:lvlJc w:val="left"/>
+      <w:pPr>
+        <w:ind w:left="720" w:hanging="360"/>
+      </w:pPr>
+    </w:lvl>
+    <w:lvl w:ilvl="1" w:tplc="14243082">
+      <w:start w:val="1"/>
+      <w:numFmt w:val="lowerLetter"/>
+      <w:lvlText w:val="%2."/>
+      <w:lvlJc w:val="left"/>
+      <w:pPr>
+        <w:ind w:left="1440" w:hanging="360"/>
+      </w:pPr>
+    </w:lvl>
+    <w:lvl w:ilvl="2" w:tplc="397CD33C">
+      <w:start w:val="1"/>
+      <w:numFmt w:val="lowerRoman"/>
+      <w:lvlText w:val="%3."/>
+      <w:lvlJc w:val="right"/>
+      <w:pPr>
+        <w:ind w:left="2160" w:hanging="180"/>
+      </w:pPr>
+    </w:lvl>
+    <w:lvl w:ilvl="3" w:tplc="5E8EF574">
+      <w:start w:val="1"/>
+      <w:numFmt w:val="decimal"/>
+      <w:lvlText w:val="%4."/>
+      <w:lvlJc w:val="left"/>
+      <w:pPr>
+        <w:ind w:left="2880" w:hanging="360"/>
+      </w:pPr>
+    </w:lvl>
+    <w:lvl w:ilvl="4" w:tplc="235CD26E">
+      <w:start w:val="1"/>
+      <w:numFmt w:val="lowerLetter"/>
+      <w:lvlText w:val="%5."/>
+      <w:lvlJc w:val="left"/>
+      <w:pPr>
+        <w:ind w:left="3600" w:hanging="360"/>
+      </w:pPr>
+    </w:lvl>
+    <w:lvl w:ilvl="5" w:tplc="64B60A04">
+      <w:start w:val="1"/>
+      <w:numFmt w:val="lowerRoman"/>
+      <w:lvlText w:val="%6."/>
+      <w:lvlJc w:val="right"/>
+      <w:pPr>
+        <w:ind w:left="4320" w:hanging="180"/>
+      </w:pPr>
+    </w:lvl>
+    <w:lvl w:ilvl="6" w:tplc="BCC2083E">
+      <w:start w:val="1"/>
+      <w:numFmt w:val="decimal"/>
+      <w:lvlText w:val="%7."/>
+      <w:lvlJc w:val="left"/>
+      <w:pPr>
+        <w:ind w:left="5040" w:hanging="360"/>
+      </w:pPr>
+    </w:lvl>
+    <w:lvl w:ilvl="7" w:tplc="9EB4F81C">
+      <w:start w:val="1"/>
+      <w:numFmt w:val="lowerLetter"/>
+      <w:lvlText w:val="%8."/>
+      <w:lvlJc w:val="left"/>
+      <w:pPr>
+        <w:ind w:left="5760" w:hanging="360"/>
+      </w:pPr>
+    </w:lvl>
+    <w:lvl w:ilvl="8" w:tplc="1450C73A">
+      <w:start w:val="1"/>
+      <w:numFmt w:val="lowerRoman"/>
+      <w:lvlText w:val="%9."/>
+      <w:lvlJc w:val="right"/>
+      <w:pPr>
+        <w:ind w:left="6480" w:hanging="180"/>
+      </w:pPr>
+    </w:lvl>
+  </w:abstractNum>
+  <w:abstractNum w:abstractNumId="3" w15:restartNumberingAfterBreak="0">
     <w:nsid w:val="528F70C1"/>
     <w:multiLevelType w:val="hybridMultilevel"/>
     <w:tmpl w:val="03F649C2"/>
@@ -639,7 +1623,206 @@
       </w:pPr>
     </w:lvl>
   </w:abstractNum>
-  <w:abstractNum w:abstractNumId="1" w15:restartNumberingAfterBreak="0">
+  <w:abstractNum w:abstractNumId="4" w15:restartNumberingAfterBreak="0">
+    <w:nsid w:val="611FE871"/>
+    <w:multiLevelType w:val="hybridMultilevel"/>
+    <w:tmpl w:val="09DED906"/>
+    <w:lvl w:ilvl="0" w:tplc="3CEC9E76">
+      <w:start w:val="1"/>
+      <w:numFmt w:val="decimal"/>
+      <w:lvlText w:val="%1."/>
+      <w:lvlJc w:val="left"/>
+      <w:pPr>
+        <w:ind w:left="720" w:hanging="360"/>
+      </w:pPr>
+    </w:lvl>
+    <w:lvl w:ilvl="1" w:tplc="AA52861E">
+      <w:start w:val="1"/>
+      <w:numFmt w:val="lowerLetter"/>
+      <w:lvlText w:val="%2."/>
+      <w:lvlJc w:val="left"/>
+      <w:pPr>
+        <w:ind w:left="1440" w:hanging="360"/>
+      </w:pPr>
+    </w:lvl>
+    <w:lvl w:ilvl="2" w:tplc="AA5AF2A6">
+      <w:start w:val="1"/>
+      <w:numFmt w:val="lowerRoman"/>
+      <w:lvlText w:val="%3."/>
+      <w:lvlJc w:val="right"/>
+      <w:pPr>
+        <w:ind w:left="2160" w:hanging="180"/>
+      </w:pPr>
+    </w:lvl>
+    <w:lvl w:ilvl="3" w:tplc="7E54F054">
+      <w:start w:val="1"/>
+      <w:numFmt w:val="decimal"/>
+      <w:lvlText w:val="%4."/>
+      <w:lvlJc w:val="left"/>
+      <w:pPr>
+        <w:ind w:left="2880" w:hanging="360"/>
+      </w:pPr>
+    </w:lvl>
+    <w:lvl w:ilvl="4" w:tplc="4C3CF6DC">
+      <w:start w:val="1"/>
+      <w:numFmt w:val="lowerLetter"/>
+      <w:lvlText w:val="%5."/>
+      <w:lvlJc w:val="left"/>
+      <w:pPr>
+        <w:ind w:left="3600" w:hanging="360"/>
+      </w:pPr>
+    </w:lvl>
+    <w:lvl w:ilvl="5" w:tplc="11CAD3D4">
+      <w:start w:val="1"/>
+      <w:numFmt w:val="lowerRoman"/>
+      <w:lvlText w:val="%6."/>
+      <w:lvlJc w:val="right"/>
+      <w:pPr>
+        <w:ind w:left="4320" w:hanging="180"/>
+      </w:pPr>
+    </w:lvl>
+    <w:lvl w:ilvl="6" w:tplc="03AAF49C">
+      <w:start w:val="1"/>
+      <w:numFmt w:val="decimal"/>
+      <w:lvlText w:val="%7."/>
+      <w:lvlJc w:val="left"/>
+      <w:pPr>
+        <w:ind w:left="5040" w:hanging="360"/>
+      </w:pPr>
+    </w:lvl>
+    <w:lvl w:ilvl="7" w:tplc="A88EF60A">
+      <w:start w:val="1"/>
+      <w:numFmt w:val="lowerLetter"/>
+      <w:lvlText w:val="%8."/>
+      <w:lvlJc w:val="left"/>
+      <w:pPr>
+        <w:ind w:left="5760" w:hanging="360"/>
+      </w:pPr>
+    </w:lvl>
+    <w:lvl w:ilvl="8" w:tplc="A2C2644E">
+      <w:start w:val="1"/>
+      <w:numFmt w:val="lowerRoman"/>
+      <w:lvlText w:val="%9."/>
+      <w:lvlJc w:val="right"/>
+      <w:pPr>
+        <w:ind w:left="6480" w:hanging="180"/>
+      </w:pPr>
+    </w:lvl>
+  </w:abstractNum>
+  <w:abstractNum w:abstractNumId="5" w15:restartNumberingAfterBreak="0">
+    <w:nsid w:val="6407225D"/>
+    <w:multiLevelType w:val="hybridMultilevel"/>
+    <w:tmpl w:val="D75435CC"/>
+    <w:lvl w:ilvl="0" w:tplc="2DBE4222">
+      <w:start w:val="1"/>
+      <w:numFmt w:val="bullet"/>
+      <w:lvlText w:val=""/>
+      <w:lvlJc w:val="left"/>
+      <w:pPr>
+        <w:ind w:left="720" w:hanging="360"/>
+      </w:pPr>
+      <w:rPr>
+        <w:rFonts w:ascii="Symbol" w:hAnsi="Symbol" w:hint="default"/>
+      </w:rPr>
+    </w:lvl>
+    <w:lvl w:ilvl="1" w:tplc="994A4DB4">
+      <w:start w:val="1"/>
+      <w:numFmt w:val="bullet"/>
+      <w:lvlText w:val="o"/>
+      <w:lvlJc w:val="left"/>
+      <w:pPr>
+        <w:ind w:left="1440" w:hanging="360"/>
+      </w:pPr>
+      <w:rPr>
+        <w:rFonts w:ascii="Courier New" w:hAnsi="Courier New" w:hint="default"/>
+      </w:rPr>
+    </w:lvl>
+    <w:lvl w:ilvl="2" w:tplc="53ECE03A">
+      <w:start w:val="1"/>
+      <w:numFmt w:val="bullet"/>
+      <w:lvlText w:val=""/>
+      <w:lvlJc w:val="left"/>
+      <w:pPr>
+        <w:ind w:left="2160" w:hanging="360"/>
+      </w:pPr>
+      <w:rPr>
+        <w:rFonts w:ascii="Wingdings" w:hAnsi="Wingdings" w:hint="default"/>
+      </w:rPr>
+    </w:lvl>
+    <w:lvl w:ilvl="3" w:tplc="911A1248">
+      <w:start w:val="1"/>
+      <w:numFmt w:val="bullet"/>
+      <w:lvlText w:val=""/>
+      <w:lvlJc w:val="left"/>
+      <w:pPr>
+        <w:ind w:left="2880" w:hanging="360"/>
+      </w:pPr>
+      <w:rPr>
+        <w:rFonts w:ascii="Symbol" w:hAnsi="Symbol" w:hint="default"/>
+      </w:rPr>
+    </w:lvl>
+    <w:lvl w:ilvl="4" w:tplc="B91CDFA2">
+      <w:start w:val="1"/>
+      <w:numFmt w:val="bullet"/>
+      <w:lvlText w:val="o"/>
+      <w:lvlJc w:val="left"/>
+      <w:pPr>
+        <w:ind w:left="3600" w:hanging="360"/>
+      </w:pPr>
+      <w:rPr>
+        <w:rFonts w:ascii="Courier New" w:hAnsi="Courier New" w:hint="default"/>
+      </w:rPr>
+    </w:lvl>
+    <w:lvl w:ilvl="5" w:tplc="DC18029E">
+      <w:start w:val="1"/>
+      <w:numFmt w:val="bullet"/>
+      <w:lvlText w:val=""/>
+      <w:lvlJc w:val="left"/>
+      <w:pPr>
+        <w:ind w:left="4320" w:hanging="360"/>
+      </w:pPr>
+      <w:rPr>
+        <w:rFonts w:ascii="Wingdings" w:hAnsi="Wingdings" w:hint="default"/>
+      </w:rPr>
+    </w:lvl>
+    <w:lvl w:ilvl="6" w:tplc="AF7EE91E">
+      <w:start w:val="1"/>
+      <w:numFmt w:val="bullet"/>
+      <w:lvlText w:val=""/>
+      <w:lvlJc w:val="left"/>
+      <w:pPr>
+        <w:ind w:left="5040" w:hanging="360"/>
+      </w:pPr>
+      <w:rPr>
+        <w:rFonts w:ascii="Symbol" w:hAnsi="Symbol" w:hint="default"/>
+      </w:rPr>
+    </w:lvl>
+    <w:lvl w:ilvl="7" w:tplc="B98A6FD2">
+      <w:start w:val="1"/>
+      <w:numFmt w:val="bullet"/>
+      <w:lvlText w:val="o"/>
+      <w:lvlJc w:val="left"/>
+      <w:pPr>
+        <w:ind w:left="5760" w:hanging="360"/>
+      </w:pPr>
+      <w:rPr>
+        <w:rFonts w:ascii="Courier New" w:hAnsi="Courier New" w:hint="default"/>
+      </w:rPr>
+    </w:lvl>
+    <w:lvl w:ilvl="8" w:tplc="554E159C">
+      <w:start w:val="1"/>
+      <w:numFmt w:val="bullet"/>
+      <w:lvlText w:val=""/>
+      <w:lvlJc w:val="left"/>
+      <w:pPr>
+        <w:ind w:left="6480" w:hanging="360"/>
+      </w:pPr>
+      <w:rPr>
+        <w:rFonts w:ascii="Wingdings" w:hAnsi="Wingdings" w:hint="default"/>
+      </w:rPr>
+    </w:lvl>
+  </w:abstractNum>
+  <w:abstractNum w:abstractNumId="6" w15:restartNumberingAfterBreak="0">
     <w:nsid w:val="66687478"/>
     <w:multiLevelType w:val="hybridMultilevel"/>
     <w:tmpl w:val="8A36BD36"/>
@@ -728,7 +1911,7 @@
       </w:pPr>
     </w:lvl>
   </w:abstractNum>
-  <w:abstractNum w:abstractNumId="2" w15:restartNumberingAfterBreak="0">
+  <w:abstractNum w:abstractNumId="7" w15:restartNumberingAfterBreak="0">
     <w:nsid w:val="69617966"/>
     <w:multiLevelType w:val="hybridMultilevel"/>
     <w:tmpl w:val="A2C2982C"/>
@@ -817,7 +2000,7 @@
       </w:pPr>
     </w:lvl>
   </w:abstractNum>
-  <w:abstractNum w:abstractNumId="3" w15:restartNumberingAfterBreak="0">
+  <w:abstractNum w:abstractNumId="8" w15:restartNumberingAfterBreak="0">
     <w:nsid w:val="6E59125B"/>
     <w:multiLevelType w:val="hybridMultilevel"/>
     <w:tmpl w:val="1E642422"/>
@@ -906,17 +2089,121 @@
       </w:pPr>
     </w:lvl>
   </w:abstractNum>
-  <w:num w:numId="1" w16cid:durableId="171988987">
+  <w:abstractNum w:abstractNumId="9" w15:restartNumberingAfterBreak="0">
+    <w:nsid w:val="7FADB6D8"/>
+    <w:multiLevelType w:val="hybridMultilevel"/>
+    <w:tmpl w:val="9BC0956E"/>
+    <w:lvl w:ilvl="0" w:tplc="10DAF426">
+      <w:start w:val="1"/>
+      <w:numFmt w:val="decimal"/>
+      <w:lvlText w:val="%1."/>
+      <w:lvlJc w:val="left"/>
+      <w:pPr>
+        <w:ind w:left="720" w:hanging="360"/>
+      </w:pPr>
+    </w:lvl>
+    <w:lvl w:ilvl="1" w:tplc="18D4F462">
+      <w:start w:val="1"/>
+      <w:numFmt w:val="lowerLetter"/>
+      <w:lvlText w:val="%2."/>
+      <w:lvlJc w:val="left"/>
+      <w:pPr>
+        <w:ind w:left="1440" w:hanging="360"/>
+      </w:pPr>
+    </w:lvl>
+    <w:lvl w:ilvl="2" w:tplc="D7A69C62">
+      <w:start w:val="1"/>
+      <w:numFmt w:val="lowerRoman"/>
+      <w:lvlText w:val="%3."/>
+      <w:lvlJc w:val="right"/>
+      <w:pPr>
+        <w:ind w:left="2160" w:hanging="180"/>
+      </w:pPr>
+    </w:lvl>
+    <w:lvl w:ilvl="3" w:tplc="E44AA382">
+      <w:start w:val="1"/>
+      <w:numFmt w:val="decimal"/>
+      <w:lvlText w:val="%4."/>
+      <w:lvlJc w:val="left"/>
+      <w:pPr>
+        <w:ind w:left="2880" w:hanging="360"/>
+      </w:pPr>
+    </w:lvl>
+    <w:lvl w:ilvl="4" w:tplc="1C82F902">
+      <w:start w:val="1"/>
+      <w:numFmt w:val="lowerLetter"/>
+      <w:lvlText w:val="%5."/>
+      <w:lvlJc w:val="left"/>
+      <w:pPr>
+        <w:ind w:left="3600" w:hanging="360"/>
+      </w:pPr>
+    </w:lvl>
+    <w:lvl w:ilvl="5" w:tplc="49B65CD8">
+      <w:start w:val="1"/>
+      <w:numFmt w:val="lowerRoman"/>
+      <w:lvlText w:val="%6."/>
+      <w:lvlJc w:val="right"/>
+      <w:pPr>
+        <w:ind w:left="4320" w:hanging="180"/>
+      </w:pPr>
+    </w:lvl>
+    <w:lvl w:ilvl="6" w:tplc="586A3058">
+      <w:start w:val="1"/>
+      <w:numFmt w:val="decimal"/>
+      <w:lvlText w:val="%7."/>
+      <w:lvlJc w:val="left"/>
+      <w:pPr>
+        <w:ind w:left="5040" w:hanging="360"/>
+      </w:pPr>
+    </w:lvl>
+    <w:lvl w:ilvl="7" w:tplc="0A70C2AE">
+      <w:start w:val="1"/>
+      <w:numFmt w:val="lowerLetter"/>
+      <w:lvlText w:val="%8."/>
+      <w:lvlJc w:val="left"/>
+      <w:pPr>
+        <w:ind w:left="5760" w:hanging="360"/>
+      </w:pPr>
+    </w:lvl>
+    <w:lvl w:ilvl="8" w:tplc="19E85FB6">
+      <w:start w:val="1"/>
+      <w:numFmt w:val="lowerRoman"/>
+      <w:lvlText w:val="%9."/>
+      <w:lvlJc w:val="right"/>
+      <w:pPr>
+        <w:ind w:left="6480" w:hanging="180"/>
+      </w:pPr>
+    </w:lvl>
+  </w:abstractNum>
+  <w:num w:numId="1" w16cid:durableId="1479344411">
+    <w:abstractNumId w:val="4"/>
+  </w:num>
+  <w:num w:numId="2" w16cid:durableId="285163502">
+    <w:abstractNumId w:val="9"/>
+  </w:num>
+  <w:num w:numId="3" w16cid:durableId="1198473822">
+    <w:abstractNumId w:val="5"/>
+  </w:num>
+  <w:num w:numId="4" w16cid:durableId="802966585">
+    <w:abstractNumId w:val="0"/>
+  </w:num>
+  <w:num w:numId="5" w16cid:durableId="2131168021">
+    <w:abstractNumId w:val="1"/>
+  </w:num>
+  <w:num w:numId="6" w16cid:durableId="181282135">
+    <w:abstractNumId w:val="2"/>
+  </w:num>
+  <w:num w:numId="7" w16cid:durableId="171988987">
+    <w:abstractNumId w:val="8"/>
+  </w:num>
+  <w:num w:numId="8" w16cid:durableId="634454808">
+    <w:abstractNumId w:val="7"/>
+  </w:num>
+  <w:num w:numId="9" w16cid:durableId="106583078">
     <w:abstractNumId w:val="3"/>
   </w:num>
-  <w:num w:numId="2" w16cid:durableId="634454808">
-    <w:abstractNumId w:val="2"/>
-  </w:num>
-  <w:num w:numId="3" w16cid:durableId="106583078">
-    <w:abstractNumId w:val="0"/>
-  </w:num>
-  <w:num w:numId="4" w16cid:durableId="1746075742">
-    <w:abstractNumId w:val="1"/>
+  <w:num w:numId="10" w16cid:durableId="1746075742">
+    <w:abstractNumId w:val="6"/>
   </w:num>
 </w:numbering>
 </file>
@@ -1847,6 +3134,28 @@
       <w:iCs/>
     </w:rPr>
   </w:style>
+  <w:style w:type="character" w:styleId="SubtleReference">
+    <w:name w:val="Subtle Reference"/>
+    <w:basedOn w:val="DefaultParagraphFont"/>
+    <w:uiPriority w:val="31"/>
+    <w:qFormat/>
+    <w:rsid w:val="41840541"/>
+    <w:rPr>
+      <w:smallCaps/>
+      <w:color w:val="5A5A5A"/>
+    </w:rPr>
+  </w:style>
+  <w:style w:type="character" w:styleId="Strong">
+    <w:name w:val="Strong"/>
+    <w:basedOn w:val="DefaultParagraphFont"/>
+    <w:uiPriority w:val="22"/>
+    <w:qFormat/>
+    <w:rsid w:val="41840541"/>
+    <w:rPr>
+      <w:b/>
+      <w:bCs/>
+    </w:rPr>
+  </w:style>
 </w:styles>
 </file>
 

</xml_diff>

<commit_message>
Added Training manual for the Master of Lies
</commit_message>
<xml_diff>
--- a/TrainingManual1_Veteran.docx
+++ b/TrainingManual1_Veteran.docx
@@ -22,6 +22,18 @@
     </w:p>
     <w:p>
       <w:pPr>
+        <w:pStyle w:val="Quote"/>
+        <w:rPr>
+          <w:i w:val="0"/>
+          <w:iCs w:val="0"/>
+        </w:rPr>
+      </w:pPr>
+      <w:r>
+        <w:t>“I know how to train lots of high-quality Troops and will use them to make sure I always have Coins.”</w:t>
+      </w:r>
+    </w:p>
+    <w:p>
+      <w:pPr>
         <w:pStyle w:val="Heading1"/>
       </w:pPr>
       <w:r>
@@ -45,41 +57,6 @@
     </w:p>
     <w:p>
       <w:pPr>
-        <w:pStyle w:val="Quote"/>
-        <w:rPr>
-          <w:rStyle w:val="Emphasis"/>
-        </w:rPr>
-      </w:pPr>
-      <w:r>
-        <w:t>“</w:t>
-      </w:r>
-      <w:r>
-        <w:t xml:space="preserve">I </w:t>
-      </w:r>
-      <w:r>
-        <w:t>know how to train</w:t>
-      </w:r>
-      <w:r>
-        <w:t xml:space="preserve"> lots of high-quality</w:t>
-      </w:r>
-      <w:r>
-        <w:t xml:space="preserve"> Troops</w:t>
-      </w:r>
-      <w:r>
-        <w:t xml:space="preserve"> and will use them to </w:t>
-      </w:r>
-      <w:r>
-        <w:t xml:space="preserve">make sure I always have </w:t>
-      </w:r>
-      <w:r>
-        <w:t>Coins.</w:t>
-      </w:r>
-      <w:r>
-        <w:t>”</w:t>
-      </w:r>
-    </w:p>
-    <w:p>
-      <w:pPr>
         <w:pStyle w:val="ListParagraph"/>
         <w:numPr>
           <w:ilvl w:val="0"/>
@@ -168,7 +145,7 @@
         </w:numPr>
       </w:pPr>
       <w:r>
-        <w:t>Ex. You should start with 6 Alliance Tokens in a 6-player game.</w:t>
+        <w:t>You should start with 6 Alliance Tokens in a 6-player game.</w:t>
       </w:r>
     </w:p>
     <w:p>
@@ -394,7 +371,6 @@
         <w:pStyle w:val="Heading2"/>
       </w:pPr>
       <w:r>
-        <w:lastRenderedPageBreak/>
         <w:t>Checkpoint</w:t>
       </w:r>
     </w:p>
@@ -430,6 +406,7 @@
         </w:rPr>
       </w:pPr>
       <w:r>
+        <w:lastRenderedPageBreak/>
         <w:t>“</w:t>
       </w:r>
       <w:r>
@@ -528,7 +505,7 @@
           <w:i/>
           <w:iCs/>
         </w:rPr>
-        <w:t xml:space="preserve">It’s not good to have fewer than 2 Troops, so </w:t>
+        <w:t>“</w:t>
       </w:r>
       <w:r>
         <w:rPr>
@@ -536,7 +513,23 @@
           <w:i/>
           <w:iCs/>
         </w:rPr>
+        <w:t xml:space="preserve">It’s not good to have fewer than 2 Troops, so </w:t>
+      </w:r>
+      <w:r>
+        <w:rPr>
+          <w:rStyle w:val="Emphasis"/>
+          <w:i/>
+          <w:iCs/>
+        </w:rPr>
         <w:t>let’s make a rule about it.</w:t>
+      </w:r>
+      <w:r>
+        <w:rPr>
+          <w:rStyle w:val="Emphasis"/>
+          <w:i/>
+          <w:iCs/>
+        </w:rPr>
+        <w:t>”</w:t>
       </w:r>
     </w:p>
     <w:p>
@@ -570,7 +563,13 @@
         <w:pStyle w:val="Quote"/>
       </w:pPr>
       <w:r>
+        <w:t>“</w:t>
+      </w:r>
+      <w:r>
         <w:t>I have the King’s Favor token, so I will start the round.</w:t>
+      </w:r>
+      <w:r>
+        <w:t>”</w:t>
       </w:r>
     </w:p>
     <w:p>
@@ -605,6 +604,9 @@
         <w:pStyle w:val="Quote"/>
       </w:pPr>
       <w:r>
+        <w:t>“</w:t>
+      </w:r>
+      <w:r>
         <w:t>I want to get some extra Troops</w:t>
       </w:r>
       <w:r>
@@ -627,6 +629,9 @@
       </w:r>
       <w:r>
         <w:t>, so I get another, for a total of 3 Troops.</w:t>
+      </w:r>
+      <w:r>
+        <w:t>”</w:t>
       </w:r>
     </w:p>
     <w:p>
@@ -652,7 +657,13 @@
         <w:pStyle w:val="Quote"/>
       </w:pPr>
       <w:r>
+        <w:t>“</w:t>
+      </w:r>
+      <w:r>
         <w:t>I will also Deploy some Troops, but my Troops are much better than the rest of yours (Elite Troops), so I get 2 extra Coins from the Royal Bank.</w:t>
+      </w:r>
+      <w:r>
+        <w:t>”</w:t>
       </w:r>
     </w:p>
     <w:p>
@@ -697,6 +708,9 @@
         <w:pStyle w:val="Quote"/>
       </w:pPr>
       <w:r>
+        <w:t>“</w:t>
+      </w:r>
+      <w:r>
         <w:t>I also want some more Cards, but I have a card that gives me 2 extra cards of my choice</w:t>
       </w:r>
       <w:r>
@@ -704,6 +718,9 @@
       </w:r>
       <w:r>
         <w:t>(Genius Commanders), so I will get 2 from each deck plus 2 more Investment cards.</w:t>
+      </w:r>
+      <w:r>
+        <w:t>”</w:t>
       </w:r>
     </w:p>
     <w:p>
@@ -774,8 +791,7 @@
           <w:b w:val="0"/>
           <w:bCs w:val="0"/>
         </w:rPr>
-        <w:lastRenderedPageBreak/>
-        <w:t xml:space="preserve">I also want to Monetize, but </w:t>
+        <w:t>“</w:t>
       </w:r>
       <w:r>
         <w:rPr>
@@ -783,7 +799,7 @@
           <w:b w:val="0"/>
           <w:bCs w:val="0"/>
         </w:rPr>
-        <w:t xml:space="preserve">the Master of Lies already used the Court Monetize, so I will use my own Monetize action </w:t>
+        <w:t xml:space="preserve">I also want to Monetize, but </w:t>
       </w:r>
       <w:r>
         <w:rPr>
@@ -791,14 +807,31 @@
           <w:b w:val="0"/>
           <w:bCs w:val="0"/>
         </w:rPr>
+        <w:t xml:space="preserve">the Master of Lies already used the Court Monetize, so I will use my own Monetize action </w:t>
+      </w:r>
+      <w:r>
+        <w:rPr>
+          <w:rStyle w:val="Strong"/>
+          <w:b w:val="0"/>
+          <w:bCs w:val="0"/>
+        </w:rPr>
         <w:t>(Innovation Hub). It gives me a better rate than the Court, so I would have used this one anyway.</w:t>
       </w:r>
+      <w:r>
+        <w:rPr>
+          <w:rStyle w:val="Strong"/>
+          <w:b w:val="0"/>
+          <w:bCs w:val="0"/>
+        </w:rPr>
+        <w:t>”</w:t>
+      </w:r>
     </w:p>
     <w:p>
       <w:pPr>
         <w:pStyle w:val="Heading2"/>
       </w:pPr>
       <w:r>
+        <w:lastRenderedPageBreak/>
         <w:t>Report Phase</w:t>
       </w:r>
     </w:p>
@@ -885,7 +918,13 @@
         <w:pStyle w:val="Quote"/>
       </w:pPr>
       <w:r>
+        <w:t>“</w:t>
+      </w:r>
+      <w:r>
         <w:t>I need some Commodities, but I’m not a fan of that Market Rate, so I will just get them for free.</w:t>
+      </w:r>
+      <w:r>
+        <w:t>”</w:t>
       </w:r>
     </w:p>
     <w:p>
@@ -941,6 +980,9 @@
         <w:pStyle w:val="Quote"/>
       </w:pPr>
       <w:r>
+        <w:t>“</w:t>
+      </w:r>
+      <w:r>
         <w:t>I want to play an Investment from my hand, so I will use the Build action</w:t>
       </w:r>
       <w:r>
@@ -951,6 +993,9 @@
       </w:r>
       <w:r>
         <w:t>. I will build it at Level 2 and pay 2 Commodities.</w:t>
+      </w:r>
+      <w:r>
+        <w:t>”</w:t>
       </w:r>
     </w:p>
     <w:p>
@@ -1069,14 +1114,25 @@
         </w:numPr>
       </w:pPr>
       <w:r>
-        <w:lastRenderedPageBreak/>
         <w:t>P</w:t>
       </w:r>
       <w:r>
         <w:t>ut the Head Banker’s card marker on the top of the scheme card</w:t>
       </w:r>
       <w:r>
-        <w:t xml:space="preserve"> and yours on the bottom.</w:t>
+        <w:t xml:space="preserve"> </w:t>
+      </w:r>
+      <w:r>
+        <w:t xml:space="preserve">(the target of the scheme) </w:t>
+      </w:r>
+      <w:r>
+        <w:t>and yours on the bottom</w:t>
+      </w:r>
+      <w:r>
+        <w:t xml:space="preserve"> (the Receiver of the scheme)</w:t>
+      </w:r>
+      <w:r>
+        <w:t>.</w:t>
       </w:r>
     </w:p>
     <w:p>
@@ -1088,7 +1144,7 @@
         </w:numPr>
       </w:pPr>
       <w:r>
-        <w:t xml:space="preserve">Put the marked scheme card back into the </w:t>
+        <w:t xml:space="preserve">Put the marked scheme card into the </w:t>
       </w:r>
       <w:r>
         <w:t xml:space="preserve">pouch </w:t>
@@ -1109,6 +1165,7 @@
         </w:numPr>
       </w:pPr>
       <w:r>
+        <w:lastRenderedPageBreak/>
         <w:t>Put your Spy into the pouch.</w:t>
       </w:r>
     </w:p>
@@ -1185,6 +1242,9 @@
         <w:pStyle w:val="Quote"/>
       </w:pPr>
       <w:r>
+        <w:t>“</w:t>
+      </w:r>
+      <w:r>
         <w:t xml:space="preserve">These Alliance Tokens allow Allies to trade non-liquid </w:t>
       </w:r>
       <w:r>
@@ -1216,6 +1276,9 @@
       </w:r>
       <w:r>
         <w:t>to Donate using the Chief Scribe’s Undeniable Advisors, so we are going to trade.</w:t>
+      </w:r>
+      <w:r>
+        <w:t>”</w:t>
       </w:r>
     </w:p>
     <w:p>

</xml_diff>

<commit_message>
Added two more training manuals
</commit_message>
<xml_diff>
--- a/TrainingManual1_Veteran.docx
+++ b/TrainingManual1_Veteran.docx
@@ -109,7 +109,15 @@
         <w:t xml:space="preserve">Place one of your </w:t>
       </w:r>
       <w:r>
-        <w:t>Alliance Tokens on the start of the Honor Track.</w:t>
+        <w:t xml:space="preserve">Alliance Tokens </w:t>
+      </w:r>
+      <w:proofErr w:type="gramStart"/>
+      <w:r>
+        <w:t>on</w:t>
+      </w:r>
+      <w:proofErr w:type="gramEnd"/>
+      <w:r>
+        <w:t xml:space="preserve"> the start of the Honor Track.</w:t>
       </w:r>
     </w:p>
     <w:p>
@@ -213,7 +221,7 @@
         <w:rPr>
           <w:rStyle w:val="SubtleReference"/>
         </w:rPr>
-        <w:t>Eager Youth</w:t>
+        <w:t>Loyal Citizenry</w:t>
       </w:r>
     </w:p>
     <w:p>
@@ -267,7 +275,15 @@
         <w:t>,</w:t>
       </w:r>
       <w:r>
-        <w:t xml:space="preserve"> on each of your Investments, denoting their level.</w:t>
+        <w:t xml:space="preserve"> on each of your </w:t>
+      </w:r>
+      <w:proofErr w:type="gramStart"/>
+      <w:r>
+        <w:t>Investments</w:t>
+      </w:r>
+      <w:proofErr w:type="gramEnd"/>
+      <w:r>
+        <w:t>, denoting their level.</w:t>
       </w:r>
     </w:p>
     <w:p>
@@ -335,39 +351,6 @@
     </w:p>
     <w:p>
       <w:pPr>
-        <w:pStyle w:val="ListParagraph"/>
-        <w:numPr>
-          <w:ilvl w:val="0"/>
-          <w:numId w:val="8"/>
-        </w:numPr>
-      </w:pPr>
-      <w:r>
-        <w:t>Find one copy of the following Investment and put it in your hand. Have the Master of Lies give you one less Investment card to star</w:t>
-      </w:r>
-      <w:r>
-        <w:t>t</w:t>
-      </w:r>
-      <w:r>
-        <w:t>.</w:t>
-      </w:r>
-    </w:p>
-    <w:p>
-      <w:pPr>
-        <w:pStyle w:val="ListParagraph"/>
-        <w:numPr>
-          <w:ilvl w:val="1"/>
-          <w:numId w:val="8"/>
-        </w:numPr>
-      </w:pPr>
-      <w:r>
-        <w:rPr>
-          <w:rStyle w:val="SubtleReference"/>
-        </w:rPr>
-        <w:t>Loyal Citizenry</w:t>
-      </w:r>
-    </w:p>
-    <w:p>
-      <w:pPr>
         <w:pStyle w:val="Heading2"/>
       </w:pPr>
       <w:r>
@@ -406,7 +389,6 @@
         </w:rPr>
       </w:pPr>
       <w:r>
-        <w:lastRenderedPageBreak/>
         <w:t>“</w:t>
       </w:r>
       <w:r>
@@ -425,6 +407,7 @@
         </w:numPr>
       </w:pPr>
       <w:r>
+        <w:lastRenderedPageBreak/>
         <w:t>Take the King’s Favor.</w:t>
       </w:r>
     </w:p>
@@ -587,13 +570,19 @@
         <w:t xml:space="preserve">Recruit </w:t>
       </w:r>
       <w:r>
-        <w:t xml:space="preserve">3 Troops with 2 Coins using </w:t>
+        <w:t xml:space="preserve">3 Troops with </w:t>
+      </w:r>
+      <w:r>
+        <w:t>3</w:t>
+      </w:r>
+      <w:r>
+        <w:t xml:space="preserve"> Coins using </w:t>
       </w:r>
       <w:r>
         <w:rPr>
           <w:rStyle w:val="SubtleReference"/>
         </w:rPr>
-        <w:t>Eager Youth</w:t>
+        <w:t>Loyal Citizenry</w:t>
       </w:r>
       <w:r>
         <w:t>.</w:t>
@@ -610,7 +599,15 @@
         <w:t>I want to get some extra Troops</w:t>
       </w:r>
       <w:r>
-        <w:t xml:space="preserve"> to work with, so I will take the Recruit action. I have to pay 1 Coin per Troop, and I can buy </w:t>
+        <w:t xml:space="preserve"> to work with, so I will take the Recruit action. I </w:t>
+      </w:r>
+      <w:proofErr w:type="gramStart"/>
+      <w:r>
+        <w:t>have to</w:t>
+      </w:r>
+      <w:proofErr w:type="gramEnd"/>
+      <w:r>
+        <w:t xml:space="preserve"> pay 1 Coin per Troop, and I can buy </w:t>
       </w:r>
       <w:r>
         <w:t>at most 2 Troops since the Leader I am using is Level 2.</w:t>
@@ -625,10 +622,40 @@
         <w:t xml:space="preserve"> I also have an Investment</w:t>
       </w:r>
       <w:r>
-        <w:t xml:space="preserve"> (Eager Youth) that gives me a free Troop after I Recruit every 2 Troops</w:t>
-      </w:r>
-      <w:r>
-        <w:t>, so I get another, for a total of 3 Troops.</w:t>
+        <w:t xml:space="preserve"> (</w:t>
+      </w:r>
+      <w:r>
+        <w:t>Loyal Citizenry</w:t>
+      </w:r>
+      <w:r>
+        <w:t xml:space="preserve">) that </w:t>
+      </w:r>
+      <w:r>
+        <w:t>allows me to purchase extra</w:t>
+      </w:r>
+      <w:r>
+        <w:t xml:space="preserve"> Troop</w:t>
+      </w:r>
+      <w:r>
+        <w:t>s</w:t>
+      </w:r>
+      <w:r>
+        <w:t xml:space="preserve"> </w:t>
+      </w:r>
+      <w:r>
+        <w:t>during</w:t>
+      </w:r>
+      <w:r>
+        <w:t xml:space="preserve"> Recruit</w:t>
+      </w:r>
+      <w:r>
+        <w:t>, so</w:t>
+      </w:r>
+      <w:r>
+        <w:t xml:space="preserve"> I will buy one more</w:t>
+      </w:r>
+      <w:r>
+        <w:t>, for a total of 3 Troops.</w:t>
       </w:r>
       <w:r>
         <w:t>”</w:t>
@@ -831,7 +858,6 @@
         <w:pStyle w:val="Heading2"/>
       </w:pPr>
       <w:r>
-        <w:lastRenderedPageBreak/>
         <w:t>Report Phase</w:t>
       </w:r>
     </w:p>
@@ -855,10 +881,19 @@
         <w:pStyle w:val="Quote"/>
       </w:pPr>
       <w:r>
+        <w:lastRenderedPageBreak/>
         <w:t>“Everyone</w:t>
       </w:r>
       <w:r>
-        <w:t xml:space="preserve"> take your Leaders back. Make sure to not change their values!”</w:t>
+        <w:t xml:space="preserve"> </w:t>
+      </w:r>
+      <w:proofErr w:type="gramStart"/>
+      <w:r>
+        <w:t>take</w:t>
+      </w:r>
+      <w:proofErr w:type="gramEnd"/>
+      <w:r>
+        <w:t xml:space="preserve"> your Leaders back. Make sure to not change their values!”</w:t>
       </w:r>
     </w:p>
     <w:p>
@@ -957,45 +992,13 @@
         <w:rPr>
           <w:rStyle w:val="Strong"/>
         </w:rPr>
-        <w:t xml:space="preserve">Build </w:t>
-      </w:r>
-      <w:r>
-        <w:t>Level 2 Investment (</w:t>
-      </w:r>
-      <w:r>
-        <w:rPr>
-          <w:rStyle w:val="SubtleReference"/>
-        </w:rPr>
-        <w:t>Loyal Citizenry</w:t>
-      </w:r>
-      <w:r>
-        <w:t>)</w:t>
+        <w:t xml:space="preserve">Negotiate </w:t>
+      </w:r>
+      <w:r>
+        <w:t>with the Chief Scribe when he prompts you</w:t>
       </w:r>
       <w:r>
         <w:t>.</w:t>
-      </w:r>
-    </w:p>
-    <w:p>
-      <w:pPr>
-        <w:pStyle w:val="Quote"/>
-      </w:pPr>
-      <w:r>
-        <w:t>“</w:t>
-      </w:r>
-      <w:r>
-        <w:t>I want to play an Investment from my hand, so I will use the Build action</w:t>
-      </w:r>
-      <w:r>
-        <w:t>. This new Investment can be at most Level 2 since I used a Level 2 Leader, but I also have to pay 1 Commodity for each level I want to give it</w:t>
-      </w:r>
-      <w:r>
-        <w:t>, just like the Upgrade action</w:t>
-      </w:r>
-      <w:r>
-        <w:t>. I will build it at Level 2 and pay 2 Commodities.</w:t>
-      </w:r>
-      <w:r>
-        <w:t>”</w:t>
       </w:r>
     </w:p>
     <w:p>
@@ -1023,7 +1026,15 @@
         <w:pStyle w:val="Quote"/>
       </w:pPr>
       <w:r>
-        <w:t>“Everyone take your Leaders back. Make sure to not change their values!”</w:t>
+        <w:t xml:space="preserve">“Everyone </w:t>
+      </w:r>
+      <w:proofErr w:type="gramStart"/>
+      <w:r>
+        <w:t>take</w:t>
+      </w:r>
+      <w:proofErr w:type="gramEnd"/>
+      <w:r>
+        <w:t xml:space="preserve"> your Leaders back. Make sure to not change their values!”</w:t>
       </w:r>
     </w:p>
     <w:p>
@@ -1165,7 +1176,6 @@
         </w:numPr>
       </w:pPr>
       <w:r>
-        <w:lastRenderedPageBreak/>
         <w:t>Put your Spy into the pouch.</w:t>
       </w:r>
     </w:p>
@@ -1182,12 +1192,14 @@
           <w:numId w:val="2"/>
         </w:numPr>
       </w:pPr>
+      <w:proofErr w:type="gramStart"/>
       <w:r>
         <w:rPr>
           <w:rStyle w:val="Strong"/>
         </w:rPr>
         <w:t>Deploy</w:t>
       </w:r>
+      <w:proofErr w:type="gramEnd"/>
     </w:p>
     <w:p>
       <w:pPr>
@@ -1219,7 +1231,7 @@
         <w:rPr>
           <w:rStyle w:val="SubtleReference"/>
         </w:rPr>
-        <w:t>Eager Youth</w:t>
+        <w:t>Loyal Citizenry</w:t>
       </w:r>
       <w:r>
         <w:t xml:space="preserve"> with the Chief Scribe in return for his </w:t>
@@ -1242,6 +1254,7 @@
         <w:pStyle w:val="Quote"/>
       </w:pPr>
       <w:r>
+        <w:lastRenderedPageBreak/>
         <w:t>“</w:t>
       </w:r>
       <w:r>
@@ -1272,7 +1285,13 @@
         <w:t xml:space="preserve">Alliance Tokens. </w:t>
       </w:r>
       <w:r>
-        <w:t xml:space="preserve">I won’t need this Eager Youth anymore, but I would love </w:t>
+        <w:t xml:space="preserve">I won’t need this </w:t>
+      </w:r>
+      <w:r>
+        <w:t>Loyal Citizenry</w:t>
+      </w:r>
+      <w:r>
+        <w:t xml:space="preserve"> anymore, but I would love </w:t>
       </w:r>
       <w:r>
         <w:t>to Donate using the Chief Scribe’s Undeniable Advisors, so we are going to trade.</w:t>
@@ -1324,7 +1343,15 @@
         <w:pStyle w:val="Quote"/>
       </w:pPr>
       <w:r>
-        <w:t>“Everyone take your Leaders back. Make sure to not change their values!”</w:t>
+        <w:t xml:space="preserve">“Everyone </w:t>
+      </w:r>
+      <w:proofErr w:type="gramStart"/>
+      <w:r>
+        <w:t>take</w:t>
+      </w:r>
+      <w:proofErr w:type="gramEnd"/>
+      <w:r>
+        <w:t xml:space="preserve"> your Leaders back. Make sure to not change their values!”</w:t>
       </w:r>
     </w:p>
     <w:sectPr>

</xml_diff>

<commit_message>
Added last two training manuals
and simplified up the training section of the spreadsheet now that the info
has been offloaded to other documents.
</commit_message>
<xml_diff>
--- a/TrainingManual1_Veteran.docx
+++ b/TrainingManual1_Veteran.docx
@@ -1111,6 +1111,17 @@
       </w:r>
       <w:r>
         <w:t>a card marker for the Head Banker and one of your own</w:t>
+      </w:r>
+      <w:r>
+        <w:t xml:space="preserve"> from </w:t>
+      </w:r>
+      <w:proofErr w:type="spellStart"/>
+      <w:r>
+        <w:t>your</w:t>
+      </w:r>
+      <w:proofErr w:type="spellEnd"/>
+      <w:r>
+        <w:t xml:space="preserve"> pouch</w:t>
       </w:r>
       <w:r>
         <w:t>.</w:t>

</xml_diff>

<commit_message>
Added pdf exports of Training Manuals
for easier reading on phones
</commit_message>
<xml_diff>
--- a/TrainingManual1_Veteran.docx
+++ b/TrainingManual1_Veteran.docx
@@ -1113,15 +1113,7 @@
         <w:t>a card marker for the Head Banker and one of your own</w:t>
       </w:r>
       <w:r>
-        <w:t xml:space="preserve"> from </w:t>
-      </w:r>
-      <w:proofErr w:type="spellStart"/>
-      <w:r>
-        <w:t>your</w:t>
-      </w:r>
-      <w:proofErr w:type="spellEnd"/>
-      <w:r>
-        <w:t xml:space="preserve"> pouch</w:t>
+        <w:t xml:space="preserve"> from your pouch</w:t>
       </w:r>
       <w:r>
         <w:t>.</w:t>

</xml_diff>

<commit_message>
Cleaned up training manuals
</commit_message>
<xml_diff>
--- a/TrainingManual1_Veteran.docx
+++ b/TrainingManual1_Veteran.docx
@@ -109,15 +109,7 @@
         <w:t xml:space="preserve">Place one of your </w:t>
       </w:r>
       <w:r>
-        <w:t xml:space="preserve">Alliance Tokens </w:t>
-      </w:r>
-      <w:proofErr w:type="gramStart"/>
-      <w:r>
-        <w:t>on</w:t>
-      </w:r>
-      <w:proofErr w:type="gramEnd"/>
-      <w:r>
-        <w:t xml:space="preserve"> the start of the Honor Track.</w:t>
+        <w:t>Alliance Tokens on the start of the Honor Track.</w:t>
       </w:r>
     </w:p>
     <w:p>
@@ -275,15 +267,7 @@
         <w:t>,</w:t>
       </w:r>
       <w:r>
-        <w:t xml:space="preserve"> on each of your </w:t>
-      </w:r>
-      <w:proofErr w:type="gramStart"/>
-      <w:r>
-        <w:t>Investments</w:t>
-      </w:r>
-      <w:proofErr w:type="gramEnd"/>
-      <w:r>
-        <w:t>, denoting their level.</w:t>
+        <w:t xml:space="preserve"> on each of your Investments, denoting their level.</w:t>
       </w:r>
     </w:p>
     <w:p>
@@ -599,15 +583,7 @@
         <w:t>I want to get some extra Troops</w:t>
       </w:r>
       <w:r>
-        <w:t xml:space="preserve"> to work with, so I will take the Recruit action. I </w:t>
-      </w:r>
-      <w:proofErr w:type="gramStart"/>
-      <w:r>
-        <w:t>have to</w:t>
-      </w:r>
-      <w:proofErr w:type="gramEnd"/>
-      <w:r>
-        <w:t xml:space="preserve"> pay 1 Coin per Troop, and I can buy </w:t>
+        <w:t xml:space="preserve"> to work with, so I will take the Recruit action. I have to pay 1 Coin per Troop, and I can buy </w:t>
       </w:r>
       <w:r>
         <w:t>at most 2 Troops since the Leader I am using is Level 2.</w:t>
@@ -885,15 +861,7 @@
         <w:t>“Everyone</w:t>
       </w:r>
       <w:r>
-        <w:t xml:space="preserve"> </w:t>
-      </w:r>
-      <w:proofErr w:type="gramStart"/>
-      <w:r>
-        <w:t>take</w:t>
-      </w:r>
-      <w:proofErr w:type="gramEnd"/>
-      <w:r>
-        <w:t xml:space="preserve"> your Leaders back. Make sure to not change their values!”</w:t>
+        <w:t xml:space="preserve"> take your Leaders back. Make sure to not change their values!”</w:t>
       </w:r>
     </w:p>
     <w:p>
@@ -1026,15 +994,7 @@
         <w:pStyle w:val="Quote"/>
       </w:pPr>
       <w:r>
-        <w:t xml:space="preserve">“Everyone </w:t>
-      </w:r>
-      <w:proofErr w:type="gramStart"/>
-      <w:r>
-        <w:t>take</w:t>
-      </w:r>
-      <w:proofErr w:type="gramEnd"/>
-      <w:r>
-        <w:t xml:space="preserve"> your Leaders back. Make sure to not change their values!”</w:t>
+        <w:t>“Everyone take your Leaders back. Make sure to not change their values!”</w:t>
       </w:r>
     </w:p>
     <w:p>
@@ -1195,14 +1155,12 @@
           <w:numId w:val="2"/>
         </w:numPr>
       </w:pPr>
-      <w:proofErr w:type="gramStart"/>
       <w:r>
         <w:rPr>
           <w:rStyle w:val="Strong"/>
         </w:rPr>
         <w:t>Deploy</w:t>
       </w:r>
-      <w:proofErr w:type="gramEnd"/>
     </w:p>
     <w:p>
       <w:pPr>
@@ -1264,28 +1222,40 @@
         <w:t xml:space="preserve">These Alliance Tokens allow Allies to trade non-liquid </w:t>
       </w:r>
       <w:r>
-        <w:t xml:space="preserve">assets. </w:t>
-      </w:r>
-      <w:r>
-        <w:t xml:space="preserve">Players can trade </w:t>
-      </w:r>
-      <w:r>
-        <w:t>liquid assets</w:t>
-      </w:r>
-      <w:r>
-        <w:t xml:space="preserve"> (Coins and Commodities)</w:t>
-      </w:r>
-      <w:r>
-        <w:t xml:space="preserve"> at any time</w:t>
-      </w:r>
-      <w:r>
-        <w:t>, even outside their turn</w:t>
-      </w:r>
-      <w:r>
-        <w:t xml:space="preserve">, but anything else can only be traded by returning </w:t>
-      </w:r>
-      <w:r>
-        <w:t xml:space="preserve">Alliance Tokens. </w:t>
+        <w:t>assets.</w:t>
+      </w:r>
+      <w:r>
+        <w:t xml:space="preserve"> As the Crime Lord explained, I could trade Coins, Commodities, or Cards without an </w:t>
+      </w:r>
+      <w:r>
+        <w:t>A</w:t>
+      </w:r>
+      <w:r>
+        <w:t xml:space="preserve">lliance </w:t>
+      </w:r>
+      <w:r>
+        <w:t>T</w:t>
+      </w:r>
+      <w:r>
+        <w:t>oken</w:t>
+      </w:r>
+      <w:r>
+        <w:t xml:space="preserve">, </w:t>
+      </w:r>
+      <w:r>
+        <w:t xml:space="preserve">but </w:t>
+      </w:r>
+      <w:r>
+        <w:t xml:space="preserve">I need </w:t>
+      </w:r>
+      <w:r>
+        <w:t xml:space="preserve">ones to trade </w:t>
+      </w:r>
+      <w:r>
+        <w:t>anything else</w:t>
+      </w:r>
+      <w:r>
+        <w:t xml:space="preserve">. </w:t>
       </w:r>
       <w:r>
         <w:t xml:space="preserve">I won’t need this </w:t>
@@ -1294,10 +1264,31 @@
         <w:t>Loyal Citizenry</w:t>
       </w:r>
       <w:r>
-        <w:t xml:space="preserve"> anymore, but I would love </w:t>
-      </w:r>
-      <w:r>
-        <w:t>to Donate using the Chief Scribe’s Undeniable Advisors, so we are going to trade.</w:t>
+        <w:t xml:space="preserve"> </w:t>
+      </w:r>
+      <w:r>
+        <w:t xml:space="preserve">Investment </w:t>
+      </w:r>
+      <w:r>
+        <w:t xml:space="preserve">anymore, but I would love </w:t>
+      </w:r>
+      <w:r>
+        <w:t xml:space="preserve">to Donate using the Chief Scribe’s Undeniable Advisors, so we are going to </w:t>
+      </w:r>
+      <w:r>
+        <w:t xml:space="preserve">perform a non-liquid </w:t>
+      </w:r>
+      <w:r>
+        <w:t>trade</w:t>
+      </w:r>
+      <w:r>
+        <w:t xml:space="preserve"> and return </w:t>
+      </w:r>
+      <w:r>
+        <w:t>an Alliance Token to each other</w:t>
+      </w:r>
+      <w:r>
+        <w:t>.</w:t>
       </w:r>
       <w:r>
         <w:t>”</w:t>
@@ -1346,15 +1337,7 @@
         <w:pStyle w:val="Quote"/>
       </w:pPr>
       <w:r>
-        <w:t xml:space="preserve">“Everyone </w:t>
-      </w:r>
-      <w:proofErr w:type="gramStart"/>
-      <w:r>
-        <w:t>take</w:t>
-      </w:r>
-      <w:proofErr w:type="gramEnd"/>
-      <w:r>
-        <w:t xml:space="preserve"> your Leaders back. Make sure to not change their values!”</w:t>
+        <w:t>“Everyone take your Leaders back. Make sure to not change their values!”</w:t>
       </w:r>
     </w:p>
     <w:sectPr>

</xml_diff>

<commit_message>
Revised training manuals after some game changes
</commit_message>
<xml_diff>
--- a/TrainingManual1_Veteran.docx
+++ b/TrainingManual1_Veteran.docx
@@ -910,10 +910,22 @@
         <w:rPr>
           <w:rStyle w:val="Strong"/>
         </w:rPr>
-        <w:t xml:space="preserve">Harvest </w:t>
-      </w:r>
-      <w:r>
-        <w:t>4 Commodities.</w:t>
+        <w:t>Collect</w:t>
+      </w:r>
+      <w:r>
+        <w:t xml:space="preserve"> </w:t>
+      </w:r>
+      <w:r>
+        <w:t xml:space="preserve">6 </w:t>
+      </w:r>
+      <w:r>
+        <w:t>Commodities</w:t>
+      </w:r>
+      <w:r>
+        <w:t xml:space="preserve"> with Eager Laborers</w:t>
+      </w:r>
+      <w:r>
+        <w:t>.</w:t>
       </w:r>
     </w:p>
     <w:p>
@@ -924,7 +936,13 @@
         <w:t>“</w:t>
       </w:r>
       <w:r>
-        <w:t>I need some Commodities, but I’m not a fan of that Market Rate, so I will just get them for free.</w:t>
+        <w:t>I need some Commodities, but I’m not a fan of that Market Rate, so I will just get them for free</w:t>
+      </w:r>
+      <w:r>
+        <w:t xml:space="preserve"> with a couple extras</w:t>
+      </w:r>
+      <w:r>
+        <w:t>.</w:t>
       </w:r>
       <w:r>
         <w:t>”</w:t>
@@ -1061,7 +1079,13 @@
         <w:t xml:space="preserve">hoose a scheme card </w:t>
       </w:r>
       <w:r>
-        <w:t xml:space="preserve">that has a “$R” </w:t>
+        <w:t>that has a “</w:t>
+      </w:r>
+      <w:r>
+        <w:t>Receiver</w:t>
+      </w:r>
+      <w:r>
+        <w:t xml:space="preserve">” </w:t>
       </w:r>
       <w:r>
         <w:t>from your hand</w:t>
@@ -1176,6 +1200,15 @@
         </w:rPr>
         <w:t>Recruit</w:t>
       </w:r>
+      <w:r>
+        <w:rPr>
+          <w:rStyle w:val="Strong"/>
+        </w:rPr>
+        <w:t xml:space="preserve"> </w:t>
+      </w:r>
+      <w:r>
+        <w:t>with a level 2 Leader.</w:t>
+      </w:r>
     </w:p>
     <w:p>
       <w:pPr>
@@ -1299,17 +1332,108 @@
         <w:pStyle w:val="ListParagraph"/>
         <w:numPr>
           <w:ilvl w:val="0"/>
-          <w:numId w:val="2"/>
+          <w:numId w:val="12"/>
         </w:numPr>
-      </w:pPr>
-      <w:r>
-        <w:t xml:space="preserve">Private </w:t>
-      </w:r>
-      <w:r>
         <w:rPr>
           <w:rStyle w:val="Strong"/>
-        </w:rPr>
-        <w:t>Monetize</w:t>
+          <w:b w:val="0"/>
+          <w:bCs w:val="0"/>
+        </w:rPr>
+      </w:pPr>
+      <w:r>
+        <w:rPr>
+          <w:rStyle w:val="Strong"/>
+        </w:rPr>
+        <w:t>Court Donate</w:t>
+      </w:r>
+      <w:r>
+        <w:rPr>
+          <w:rStyle w:val="Strong"/>
+          <w:b w:val="0"/>
+          <w:bCs w:val="0"/>
+        </w:rPr>
+        <w:t xml:space="preserve"> with a level 3 Leader.</w:t>
+      </w:r>
+    </w:p>
+    <w:p>
+      <w:pPr>
+        <w:pStyle w:val="Quote"/>
+        <w:rPr>
+          <w:b/>
+          <w:bCs/>
+        </w:rPr>
+      </w:pPr>
+      <w:r>
+        <w:rPr>
+          <w:rStyle w:val="Strong"/>
+          <w:b w:val="0"/>
+          <w:bCs w:val="0"/>
+        </w:rPr>
+        <w:t>“</w:t>
+      </w:r>
+      <w:r>
+        <w:rPr>
+          <w:rStyle w:val="Strong"/>
+          <w:b w:val="0"/>
+          <w:bCs w:val="0"/>
+        </w:rPr>
+        <w:t>I have extra Coins, so I will Donate them</w:t>
+      </w:r>
+      <w:r>
+        <w:rPr>
+          <w:rStyle w:val="Strong"/>
+          <w:b w:val="0"/>
+          <w:bCs w:val="0"/>
+        </w:rPr>
+        <w:t xml:space="preserve"> to the King</w:t>
+      </w:r>
+      <w:r>
+        <w:rPr>
+          <w:rStyle w:val="Strong"/>
+          <w:b w:val="0"/>
+          <w:bCs w:val="0"/>
+        </w:rPr>
+        <w:t xml:space="preserve">. I may Donate 1 Coin per Leader Level. I’ll put those </w:t>
+      </w:r>
+      <w:r>
+        <w:rPr>
+          <w:rStyle w:val="Strong"/>
+          <w:b w:val="0"/>
+          <w:bCs w:val="0"/>
+        </w:rPr>
+        <w:t>3</w:t>
+      </w:r>
+      <w:r>
+        <w:rPr>
+          <w:rStyle w:val="Strong"/>
+          <w:b w:val="0"/>
+          <w:bCs w:val="0"/>
+        </w:rPr>
+        <w:t xml:space="preserve"> Coins in the Royal Bank and gain half (rounded up) the number of Coins I donated in Honor for a total of </w:t>
+      </w:r>
+      <w:r>
+        <w:rPr>
+          <w:rStyle w:val="Strong"/>
+          <w:b w:val="0"/>
+          <w:bCs w:val="0"/>
+        </w:rPr>
+        <w:t>2</w:t>
+      </w:r>
+      <w:r>
+        <w:rPr>
+          <w:rStyle w:val="Strong"/>
+          <w:b w:val="0"/>
+          <w:bCs w:val="0"/>
+        </w:rPr>
+        <w:t xml:space="preserve"> Honor.</w:t>
+      </w:r>
+      <w:r>
+        <w:rPr>
+          <w:rStyle w:val="Strong"/>
+          <w:b w:val="0"/>
+          <w:bCs w:val="0"/>
+        </w:rPr>
+        <w:t>”</w:t>
       </w:r>
     </w:p>
     <w:p>
@@ -1525,6 +1649,92 @@
     </w:lvl>
   </w:abstractNum>
   <w:abstractNum w:abstractNumId="2" w15:restartNumberingAfterBreak="0">
+    <w:nsid w:val="1C96543C"/>
+    <w:multiLevelType w:val="hybridMultilevel"/>
+    <w:tmpl w:val="12582E12"/>
+    <w:lvl w:ilvl="0" w:tplc="FFFFFFFF">
+      <w:start w:val="1"/>
+      <w:numFmt w:val="decimal"/>
+      <w:lvlText w:val="%1."/>
+      <w:lvlJc w:val="left"/>
+      <w:pPr>
+        <w:ind w:left="720" w:hanging="360"/>
+      </w:pPr>
+    </w:lvl>
+    <w:lvl w:ilvl="1" w:tplc="FFFFFFFF">
+      <w:start w:val="1"/>
+      <w:numFmt w:val="lowerLetter"/>
+      <w:lvlText w:val="%2."/>
+      <w:lvlJc w:val="left"/>
+      <w:pPr>
+        <w:ind w:left="1440" w:hanging="360"/>
+      </w:pPr>
+    </w:lvl>
+    <w:lvl w:ilvl="2" w:tplc="FFFFFFFF">
+      <w:start w:val="1"/>
+      <w:numFmt w:val="lowerRoman"/>
+      <w:lvlText w:val="%3."/>
+      <w:lvlJc w:val="right"/>
+      <w:pPr>
+        <w:ind w:left="2160" w:hanging="180"/>
+      </w:pPr>
+    </w:lvl>
+    <w:lvl w:ilvl="3" w:tplc="FFFFFFFF">
+      <w:start w:val="1"/>
+      <w:numFmt w:val="decimal"/>
+      <w:lvlText w:val="%4."/>
+      <w:lvlJc w:val="left"/>
+      <w:pPr>
+        <w:ind w:left="2880" w:hanging="360"/>
+      </w:pPr>
+    </w:lvl>
+    <w:lvl w:ilvl="4" w:tplc="FFFFFFFF">
+      <w:start w:val="1"/>
+      <w:numFmt w:val="lowerLetter"/>
+      <w:lvlText w:val="%5."/>
+      <w:lvlJc w:val="left"/>
+      <w:pPr>
+        <w:ind w:left="3600" w:hanging="360"/>
+      </w:pPr>
+    </w:lvl>
+    <w:lvl w:ilvl="5" w:tplc="FFFFFFFF">
+      <w:start w:val="1"/>
+      <w:numFmt w:val="lowerRoman"/>
+      <w:lvlText w:val="%6."/>
+      <w:lvlJc w:val="right"/>
+      <w:pPr>
+        <w:ind w:left="4320" w:hanging="180"/>
+      </w:pPr>
+    </w:lvl>
+    <w:lvl w:ilvl="6" w:tplc="FFFFFFFF">
+      <w:start w:val="1"/>
+      <w:numFmt w:val="decimal"/>
+      <w:lvlText w:val="%7."/>
+      <w:lvlJc w:val="left"/>
+      <w:pPr>
+        <w:ind w:left="5040" w:hanging="360"/>
+      </w:pPr>
+    </w:lvl>
+    <w:lvl w:ilvl="7" w:tplc="FFFFFFFF">
+      <w:start w:val="1"/>
+      <w:numFmt w:val="lowerLetter"/>
+      <w:lvlText w:val="%8."/>
+      <w:lvlJc w:val="left"/>
+      <w:pPr>
+        <w:ind w:left="5760" w:hanging="360"/>
+      </w:pPr>
+    </w:lvl>
+    <w:lvl w:ilvl="8" w:tplc="FFFFFFFF">
+      <w:start w:val="1"/>
+      <w:numFmt w:val="lowerRoman"/>
+      <w:lvlText w:val="%9."/>
+      <w:lvlJc w:val="right"/>
+      <w:pPr>
+        <w:ind w:left="6480" w:hanging="180"/>
+      </w:pPr>
+    </w:lvl>
+  </w:abstractNum>
+  <w:abstractNum w:abstractNumId="3" w15:restartNumberingAfterBreak="0">
     <w:nsid w:val="3C6D4415"/>
     <w:multiLevelType w:val="hybridMultilevel"/>
     <w:tmpl w:val="2EB65FD4"/>
@@ -1610,7 +1820,7 @@
       </w:pPr>
     </w:lvl>
   </w:abstractNum>
-  <w:abstractNum w:abstractNumId="3" w15:restartNumberingAfterBreak="0">
+  <w:abstractNum w:abstractNumId="4" w15:restartNumberingAfterBreak="0">
     <w:nsid w:val="528F70C1"/>
     <w:multiLevelType w:val="hybridMultilevel"/>
     <w:tmpl w:val="03F649C2"/>
@@ -1699,7 +1909,7 @@
       </w:pPr>
     </w:lvl>
   </w:abstractNum>
-  <w:abstractNum w:abstractNumId="4" w15:restartNumberingAfterBreak="0">
+  <w:abstractNum w:abstractNumId="5" w15:restartNumberingAfterBreak="0">
     <w:nsid w:val="611FE871"/>
     <w:multiLevelType w:val="hybridMultilevel"/>
     <w:tmpl w:val="09DED906"/>
@@ -1785,7 +1995,7 @@
       </w:pPr>
     </w:lvl>
   </w:abstractNum>
-  <w:abstractNum w:abstractNumId="5" w15:restartNumberingAfterBreak="0">
+  <w:abstractNum w:abstractNumId="6" w15:restartNumberingAfterBreak="0">
     <w:nsid w:val="6407225D"/>
     <w:multiLevelType w:val="hybridMultilevel"/>
     <w:tmpl w:val="D75435CC"/>
@@ -1898,7 +2108,7 @@
       </w:rPr>
     </w:lvl>
   </w:abstractNum>
-  <w:abstractNum w:abstractNumId="6" w15:restartNumberingAfterBreak="0">
+  <w:abstractNum w:abstractNumId="7" w15:restartNumberingAfterBreak="0">
     <w:nsid w:val="66687478"/>
     <w:multiLevelType w:val="hybridMultilevel"/>
     <w:tmpl w:val="8A36BD36"/>
@@ -1987,7 +2197,7 @@
       </w:pPr>
     </w:lvl>
   </w:abstractNum>
-  <w:abstractNum w:abstractNumId="7" w15:restartNumberingAfterBreak="0">
+  <w:abstractNum w:abstractNumId="8" w15:restartNumberingAfterBreak="0">
     <w:nsid w:val="69617966"/>
     <w:multiLevelType w:val="hybridMultilevel"/>
     <w:tmpl w:val="A2C2982C"/>
@@ -2076,7 +2286,7 @@
       </w:pPr>
     </w:lvl>
   </w:abstractNum>
-  <w:abstractNum w:abstractNumId="8" w15:restartNumberingAfterBreak="0">
+  <w:abstractNum w:abstractNumId="9" w15:restartNumberingAfterBreak="0">
     <w:nsid w:val="6E59125B"/>
     <w:multiLevelType w:val="hybridMultilevel"/>
     <w:tmpl w:val="1E642422"/>
@@ -2165,11 +2375,11 @@
       </w:pPr>
     </w:lvl>
   </w:abstractNum>
-  <w:abstractNum w:abstractNumId="9" w15:restartNumberingAfterBreak="0">
-    <w:nsid w:val="7FADB6D8"/>
+  <w:abstractNum w:abstractNumId="10" w15:restartNumberingAfterBreak="0">
+    <w:nsid w:val="72F15738"/>
     <w:multiLevelType w:val="hybridMultilevel"/>
     <w:tmpl w:val="9BC0956E"/>
-    <w:lvl w:ilvl="0" w:tplc="10DAF426">
+    <w:lvl w:ilvl="0" w:tplc="FFFFFFFF">
       <w:start w:val="1"/>
       <w:numFmt w:val="decimal"/>
       <w:lvlText w:val="%1."/>
@@ -2178,7 +2388,7 @@
         <w:ind w:left="720" w:hanging="360"/>
       </w:pPr>
     </w:lvl>
-    <w:lvl w:ilvl="1" w:tplc="18D4F462">
+    <w:lvl w:ilvl="1" w:tplc="FFFFFFFF">
       <w:start w:val="1"/>
       <w:numFmt w:val="lowerLetter"/>
       <w:lvlText w:val="%2."/>
@@ -2187,7 +2397,7 @@
         <w:ind w:left="1440" w:hanging="360"/>
       </w:pPr>
     </w:lvl>
-    <w:lvl w:ilvl="2" w:tplc="D7A69C62">
+    <w:lvl w:ilvl="2" w:tplc="FFFFFFFF">
       <w:start w:val="1"/>
       <w:numFmt w:val="lowerRoman"/>
       <w:lvlText w:val="%3."/>
@@ -2196,7 +2406,7 @@
         <w:ind w:left="2160" w:hanging="180"/>
       </w:pPr>
     </w:lvl>
-    <w:lvl w:ilvl="3" w:tplc="E44AA382">
+    <w:lvl w:ilvl="3" w:tplc="FFFFFFFF">
       <w:start w:val="1"/>
       <w:numFmt w:val="decimal"/>
       <w:lvlText w:val="%4."/>
@@ -2205,7 +2415,7 @@
         <w:ind w:left="2880" w:hanging="360"/>
       </w:pPr>
     </w:lvl>
-    <w:lvl w:ilvl="4" w:tplc="1C82F902">
+    <w:lvl w:ilvl="4" w:tplc="FFFFFFFF">
       <w:start w:val="1"/>
       <w:numFmt w:val="lowerLetter"/>
       <w:lvlText w:val="%5."/>
@@ -2214,7 +2424,7 @@
         <w:ind w:left="3600" w:hanging="360"/>
       </w:pPr>
     </w:lvl>
-    <w:lvl w:ilvl="5" w:tplc="49B65CD8">
+    <w:lvl w:ilvl="5" w:tplc="FFFFFFFF">
       <w:start w:val="1"/>
       <w:numFmt w:val="lowerRoman"/>
       <w:lvlText w:val="%6."/>
@@ -2223,7 +2433,7 @@
         <w:ind w:left="4320" w:hanging="180"/>
       </w:pPr>
     </w:lvl>
-    <w:lvl w:ilvl="6" w:tplc="586A3058">
+    <w:lvl w:ilvl="6" w:tplc="FFFFFFFF">
       <w:start w:val="1"/>
       <w:numFmt w:val="decimal"/>
       <w:lvlText w:val="%7."/>
@@ -2232,7 +2442,7 @@
         <w:ind w:left="5040" w:hanging="360"/>
       </w:pPr>
     </w:lvl>
-    <w:lvl w:ilvl="7" w:tplc="0A70C2AE">
+    <w:lvl w:ilvl="7" w:tplc="FFFFFFFF">
       <w:start w:val="1"/>
       <w:numFmt w:val="lowerLetter"/>
       <w:lvlText w:val="%8."/>
@@ -2241,7 +2451,7 @@
         <w:ind w:left="5760" w:hanging="360"/>
       </w:pPr>
     </w:lvl>
-    <w:lvl w:ilvl="8" w:tplc="19E85FB6">
+    <w:lvl w:ilvl="8" w:tplc="FFFFFFFF">
       <w:start w:val="1"/>
       <w:numFmt w:val="lowerRoman"/>
       <w:lvlText w:val="%9."/>
@@ -2251,14 +2461,100 @@
       </w:pPr>
     </w:lvl>
   </w:abstractNum>
+  <w:abstractNum w:abstractNumId="11" w15:restartNumberingAfterBreak="0">
+    <w:nsid w:val="7FADB6D8"/>
+    <w:multiLevelType w:val="hybridMultilevel"/>
+    <w:tmpl w:val="12582E12"/>
+    <w:lvl w:ilvl="0" w:tplc="10DAF426">
+      <w:start w:val="1"/>
+      <w:numFmt w:val="decimal"/>
+      <w:lvlText w:val="%1."/>
+      <w:lvlJc w:val="left"/>
+      <w:pPr>
+        <w:ind w:left="720" w:hanging="360"/>
+      </w:pPr>
+    </w:lvl>
+    <w:lvl w:ilvl="1" w:tplc="18D4F462">
+      <w:start w:val="1"/>
+      <w:numFmt w:val="lowerLetter"/>
+      <w:lvlText w:val="%2."/>
+      <w:lvlJc w:val="left"/>
+      <w:pPr>
+        <w:ind w:left="1440" w:hanging="360"/>
+      </w:pPr>
+    </w:lvl>
+    <w:lvl w:ilvl="2" w:tplc="D7A69C62">
+      <w:start w:val="1"/>
+      <w:numFmt w:val="lowerRoman"/>
+      <w:lvlText w:val="%3."/>
+      <w:lvlJc w:val="right"/>
+      <w:pPr>
+        <w:ind w:left="2160" w:hanging="180"/>
+      </w:pPr>
+    </w:lvl>
+    <w:lvl w:ilvl="3" w:tplc="E44AA382">
+      <w:start w:val="1"/>
+      <w:numFmt w:val="decimal"/>
+      <w:lvlText w:val="%4."/>
+      <w:lvlJc w:val="left"/>
+      <w:pPr>
+        <w:ind w:left="2880" w:hanging="360"/>
+      </w:pPr>
+    </w:lvl>
+    <w:lvl w:ilvl="4" w:tplc="1C82F902">
+      <w:start w:val="1"/>
+      <w:numFmt w:val="lowerLetter"/>
+      <w:lvlText w:val="%5."/>
+      <w:lvlJc w:val="left"/>
+      <w:pPr>
+        <w:ind w:left="3600" w:hanging="360"/>
+      </w:pPr>
+    </w:lvl>
+    <w:lvl w:ilvl="5" w:tplc="49B65CD8">
+      <w:start w:val="1"/>
+      <w:numFmt w:val="lowerRoman"/>
+      <w:lvlText w:val="%6."/>
+      <w:lvlJc w:val="right"/>
+      <w:pPr>
+        <w:ind w:left="4320" w:hanging="180"/>
+      </w:pPr>
+    </w:lvl>
+    <w:lvl w:ilvl="6" w:tplc="586A3058">
+      <w:start w:val="1"/>
+      <w:numFmt w:val="decimal"/>
+      <w:lvlText w:val="%7."/>
+      <w:lvlJc w:val="left"/>
+      <w:pPr>
+        <w:ind w:left="5040" w:hanging="360"/>
+      </w:pPr>
+    </w:lvl>
+    <w:lvl w:ilvl="7" w:tplc="0A70C2AE">
+      <w:start w:val="1"/>
+      <w:numFmt w:val="lowerLetter"/>
+      <w:lvlText w:val="%8."/>
+      <w:lvlJc w:val="left"/>
+      <w:pPr>
+        <w:ind w:left="5760" w:hanging="360"/>
+      </w:pPr>
+    </w:lvl>
+    <w:lvl w:ilvl="8" w:tplc="19E85FB6">
+      <w:start w:val="1"/>
+      <w:numFmt w:val="lowerRoman"/>
+      <w:lvlText w:val="%9."/>
+      <w:lvlJc w:val="right"/>
+      <w:pPr>
+        <w:ind w:left="6480" w:hanging="180"/>
+      </w:pPr>
+    </w:lvl>
+  </w:abstractNum>
   <w:num w:numId="1" w16cid:durableId="1479344411">
-    <w:abstractNumId w:val="4"/>
+    <w:abstractNumId w:val="5"/>
   </w:num>
   <w:num w:numId="2" w16cid:durableId="285163502">
-    <w:abstractNumId w:val="9"/>
+    <w:abstractNumId w:val="11"/>
   </w:num>
   <w:num w:numId="3" w16cid:durableId="1198473822">
-    <w:abstractNumId w:val="5"/>
+    <w:abstractNumId w:val="6"/>
   </w:num>
   <w:num w:numId="4" w16cid:durableId="802966585">
     <w:abstractNumId w:val="0"/>
@@ -2267,19 +2563,25 @@
     <w:abstractNumId w:val="1"/>
   </w:num>
   <w:num w:numId="6" w16cid:durableId="181282135">
-    <w:abstractNumId w:val="2"/>
+    <w:abstractNumId w:val="3"/>
   </w:num>
   <w:num w:numId="7" w16cid:durableId="171988987">
+    <w:abstractNumId w:val="9"/>
+  </w:num>
+  <w:num w:numId="8" w16cid:durableId="634454808">
     <w:abstractNumId w:val="8"/>
   </w:num>
-  <w:num w:numId="8" w16cid:durableId="634454808">
+  <w:num w:numId="9" w16cid:durableId="106583078">
+    <w:abstractNumId w:val="4"/>
+  </w:num>
+  <w:num w:numId="10" w16cid:durableId="1746075742">
     <w:abstractNumId w:val="7"/>
   </w:num>
-  <w:num w:numId="9" w16cid:durableId="106583078">
-    <w:abstractNumId w:val="3"/>
+  <w:num w:numId="11" w16cid:durableId="1017123504">
+    <w:abstractNumId w:val="10"/>
   </w:num>
-  <w:num w:numId="10" w16cid:durableId="1746075742">
-    <w:abstractNumId w:val="6"/>
+  <w:num w:numId="12" w16cid:durableId="1294556284">
+    <w:abstractNumId w:val="2"/>
   </w:num>
 </w:numbering>
 </file>
@@ -2886,7 +3188,6 @@
   <w:style w:type="character" w:default="1" w:styleId="DefaultParagraphFont">
     <w:name w:val="Default Paragraph Font"/>
     <w:uiPriority w:val="1"/>
-    <w:semiHidden/>
     <w:unhideWhenUsed/>
   </w:style>
   <w:style w:type="table" w:default="1" w:styleId="TableNormal">

</xml_diff>